<commit_message>
Add min/max length validation to string input
Introduced a new getStringInput overload in UI.java to support both minimum and maximum length restrictions. Updated Wordle.java to use the new method and fixed hardcoded word selection for easier testing. Input validation now provides clearer feedback for invalid input lengths.
</commit_message>
<xml_diff>
--- a/Modules/Semester_1/Modern Code/Aufgaben/05_Wordle/Protocol.docx
+++ b/Modules/Semester_1/Modern Code/Aufgaben/05_Wordle/Protocol.docx
@@ -284,13 +284,8 @@
                                 <w:r>
                                   <w:tab/>
                                 </w:r>
-                                <w:proofErr w:type="gramStart"/>
                                 <w:r>
-                                  <w:t>XX:XX</w:t>
-                                </w:r>
-                                <w:proofErr w:type="gramEnd"/>
-                                <w:r>
-                                  <w:t>:XX</w:t>
+                                  <w:t>XX:XX:XX</w:t>
                                 </w:r>
                               </w:p>
                             </w:txbxContent>
@@ -399,13 +394,8 @@
                           <w:r>
                             <w:tab/>
                           </w:r>
-                          <w:proofErr w:type="gramStart"/>
                           <w:r>
-                            <w:t>XX:XX</w:t>
-                          </w:r>
-                          <w:proofErr w:type="gramEnd"/>
-                          <w:r>
-                            <w:t>:XX</w:t>
+                            <w:t>XX:XX:XX</w:t>
                           </w:r>
                         </w:p>
                       </w:txbxContent>
@@ -2455,289 +2445,476 @@
     <w:p>
       <w:pPr>
         <w:pStyle w:val="Pseoudocode"/>
-      </w:pPr>
-      <w:r>
+        <w:rPr>
+          <w:lang w:val="en-US"/>
+        </w:rPr>
+      </w:pPr>
+      <w:r>
+        <w:rPr>
+          <w:lang w:val="en-US"/>
+        </w:rPr>
         <w:t>/**</w:t>
       </w:r>
       <w:r>
+        <w:rPr>
+          <w:lang w:val="en-US"/>
+        </w:rPr>
         <w:br/>
         <w:t xml:space="preserve"> * Reads a CSV file and returns a set of words.</w:t>
       </w:r>
       <w:r>
+        <w:rPr>
+          <w:lang w:val="en-US"/>
+        </w:rPr>
         <w:br/>
         <w:t xml:space="preserve"> *</w:t>
       </w:r>
       <w:r>
+        <w:rPr>
+          <w:lang w:val="en-US"/>
+        </w:rPr>
         <w:br/>
         <w:t xml:space="preserve"> * @param file The path to the CSV file.</w:t>
       </w:r>
       <w:r>
+        <w:rPr>
+          <w:lang w:val="en-US"/>
+        </w:rPr>
         <w:br/>
         <w:t xml:space="preserve"> * @return A set of words read from the file.</w:t>
       </w:r>
       <w:r>
+        <w:rPr>
+          <w:lang w:val="en-US"/>
+        </w:rPr>
         <w:br/>
         <w:t xml:space="preserve"> */</w:t>
       </w:r>
       <w:r>
+        <w:rPr>
+          <w:lang w:val="en-US"/>
+        </w:rPr>
         <w:br/>
         <w:t xml:space="preserve">public static Set&lt;String&gt; </w:t>
       </w:r>
       <w:proofErr w:type="spellStart"/>
       <w:r>
+        <w:rPr>
+          <w:lang w:val="en-US"/>
+        </w:rPr>
         <w:t>readCsvFile</w:t>
       </w:r>
       <w:proofErr w:type="spellEnd"/>
       <w:r>
+        <w:rPr>
+          <w:lang w:val="en-US"/>
+        </w:rPr>
         <w:t>(String file)</w:t>
       </w:r>
       <w:r>
+        <w:rPr>
+          <w:lang w:val="en-US"/>
+        </w:rPr>
         <w:br/>
         <w:t>{</w:t>
       </w:r>
       <w:r>
+        <w:rPr>
+          <w:lang w:val="en-US"/>
+        </w:rPr>
         <w:br/>
         <w:t xml:space="preserve">    Set&lt;String&gt; words = new HashSet&lt;&gt;();</w:t>
       </w:r>
       <w:r>
-        <w:br/>
-      </w:r>
-      <w:r>
+        <w:rPr>
+          <w:lang w:val="en-US"/>
+        </w:rPr>
+        <w:br/>
+      </w:r>
+      <w:r>
+        <w:rPr>
+          <w:lang w:val="en-US"/>
+        </w:rPr>
         <w:br/>
         <w:t xml:space="preserve">    try (</w:t>
       </w:r>
       <w:proofErr w:type="spellStart"/>
       <w:r>
+        <w:rPr>
+          <w:lang w:val="en-US"/>
+        </w:rPr>
         <w:t>BufferedReader</w:t>
       </w:r>
       <w:proofErr w:type="spellEnd"/>
       <w:r>
+        <w:rPr>
+          <w:lang w:val="en-US"/>
+        </w:rPr>
         <w:t xml:space="preserve"> reader = </w:t>
       </w:r>
       <w:proofErr w:type="spellStart"/>
       <w:r>
+        <w:rPr>
+          <w:lang w:val="en-US"/>
+        </w:rPr>
         <w:t>Files.newBufferedReader</w:t>
       </w:r>
       <w:proofErr w:type="spellEnd"/>
       <w:r>
+        <w:rPr>
+          <w:lang w:val="en-US"/>
+        </w:rPr>
         <w:t>(</w:t>
       </w:r>
       <w:proofErr w:type="spellStart"/>
       <w:r>
+        <w:rPr>
+          <w:lang w:val="en-US"/>
+        </w:rPr>
         <w:t>Path.of</w:t>
       </w:r>
       <w:proofErr w:type="spellEnd"/>
       <w:r>
+        <w:rPr>
+          <w:lang w:val="en-US"/>
+        </w:rPr>
         <w:t>(file)))</w:t>
       </w:r>
       <w:r>
+        <w:rPr>
+          <w:lang w:val="en-US"/>
+        </w:rPr>
         <w:br/>
         <w:t xml:space="preserve">    {</w:t>
       </w:r>
       <w:r>
+        <w:rPr>
+          <w:lang w:val="en-US"/>
+        </w:rPr>
         <w:br/>
         <w:t xml:space="preserve">        String line;</w:t>
       </w:r>
       <w:r>
-        <w:br/>
-      </w:r>
-      <w:r>
+        <w:rPr>
+          <w:lang w:val="en-US"/>
+        </w:rPr>
+        <w:br/>
+      </w:r>
+      <w:r>
+        <w:rPr>
+          <w:lang w:val="en-US"/>
+        </w:rPr>
         <w:br/>
         <w:t xml:space="preserve">        // Skip header</w:t>
       </w:r>
       <w:r>
+        <w:rPr>
+          <w:lang w:val="en-US"/>
+        </w:rPr>
         <w:br/>
         <w:t xml:space="preserve">        </w:t>
       </w:r>
       <w:proofErr w:type="spellStart"/>
       <w:r>
+        <w:rPr>
+          <w:lang w:val="en-US"/>
+        </w:rPr>
         <w:t>reader.readLine</w:t>
       </w:r>
       <w:proofErr w:type="spellEnd"/>
       <w:r>
+        <w:rPr>
+          <w:lang w:val="en-US"/>
+        </w:rPr>
         <w:t>();</w:t>
       </w:r>
       <w:r>
-        <w:br/>
-      </w:r>
-      <w:r>
+        <w:rPr>
+          <w:lang w:val="en-US"/>
+        </w:rPr>
+        <w:br/>
+      </w:r>
+      <w:r>
+        <w:rPr>
+          <w:lang w:val="en-US"/>
+        </w:rPr>
         <w:br/>
         <w:t xml:space="preserve">        while ((line = </w:t>
       </w:r>
       <w:proofErr w:type="spellStart"/>
       <w:r>
+        <w:rPr>
+          <w:lang w:val="en-US"/>
+        </w:rPr>
         <w:t>reader.readLine</w:t>
       </w:r>
       <w:proofErr w:type="spellEnd"/>
       <w:r>
+        <w:rPr>
+          <w:lang w:val="en-US"/>
+        </w:rPr>
         <w:t>()) != null)</w:t>
       </w:r>
       <w:r>
+        <w:rPr>
+          <w:lang w:val="en-US"/>
+        </w:rPr>
         <w:br/>
         <w:t xml:space="preserve">        {</w:t>
       </w:r>
       <w:r>
+        <w:rPr>
+          <w:lang w:val="en-US"/>
+        </w:rPr>
         <w:br/>
         <w:t xml:space="preserve">            line = </w:t>
       </w:r>
       <w:proofErr w:type="spellStart"/>
       <w:r>
+        <w:rPr>
+          <w:lang w:val="en-US"/>
+        </w:rPr>
         <w:t>line.trim</w:t>
       </w:r>
       <w:proofErr w:type="spellEnd"/>
       <w:r>
+        <w:rPr>
+          <w:lang w:val="en-US"/>
+        </w:rPr>
         <w:t>().</w:t>
       </w:r>
       <w:proofErr w:type="spellStart"/>
       <w:r>
+        <w:rPr>
+          <w:lang w:val="en-US"/>
+        </w:rPr>
         <w:t>toLowerCase</w:t>
       </w:r>
       <w:proofErr w:type="spellEnd"/>
       <w:r>
+        <w:rPr>
+          <w:lang w:val="en-US"/>
+        </w:rPr>
         <w:t>();</w:t>
       </w:r>
       <w:r>
-        <w:br/>
-      </w:r>
-      <w:r>
+        <w:rPr>
+          <w:lang w:val="en-US"/>
+        </w:rPr>
+        <w:br/>
+      </w:r>
+      <w:r>
+        <w:rPr>
+          <w:lang w:val="en-US"/>
+        </w:rPr>
         <w:br/>
         <w:t xml:space="preserve">            if (!</w:t>
       </w:r>
       <w:proofErr w:type="spellStart"/>
       <w:r>
+        <w:rPr>
+          <w:lang w:val="en-US"/>
+        </w:rPr>
         <w:t>line.isEmpty</w:t>
       </w:r>
       <w:proofErr w:type="spellEnd"/>
       <w:r>
+        <w:rPr>
+          <w:lang w:val="en-US"/>
+        </w:rPr>
         <w:t>())</w:t>
       </w:r>
       <w:r>
+        <w:rPr>
+          <w:lang w:val="en-US"/>
+        </w:rPr>
         <w:br/>
         <w:t xml:space="preserve">            {</w:t>
       </w:r>
       <w:r>
+        <w:rPr>
+          <w:lang w:val="en-US"/>
+        </w:rPr>
         <w:br/>
         <w:t xml:space="preserve">                </w:t>
       </w:r>
       <w:proofErr w:type="spellStart"/>
       <w:r>
+        <w:rPr>
+          <w:lang w:val="en-US"/>
+        </w:rPr>
         <w:t>words.add</w:t>
       </w:r>
       <w:proofErr w:type="spellEnd"/>
       <w:r>
+        <w:rPr>
+          <w:lang w:val="en-US"/>
+        </w:rPr>
         <w:t>(line);</w:t>
       </w:r>
       <w:r>
+        <w:rPr>
+          <w:lang w:val="en-US"/>
+        </w:rPr>
         <w:br/>
         <w:t xml:space="preserve">            }</w:t>
       </w:r>
       <w:r>
+        <w:rPr>
+          <w:lang w:val="en-US"/>
+        </w:rPr>
         <w:br/>
         <w:t xml:space="preserve">        }</w:t>
       </w:r>
       <w:r>
+        <w:rPr>
+          <w:lang w:val="en-US"/>
+        </w:rPr>
         <w:br/>
         <w:t xml:space="preserve">    }</w:t>
       </w:r>
       <w:r>
+        <w:rPr>
+          <w:lang w:val="en-US"/>
+        </w:rPr>
         <w:br/>
         <w:t xml:space="preserve">    catch (IOException e)</w:t>
       </w:r>
       <w:r>
+        <w:rPr>
+          <w:lang w:val="en-US"/>
+        </w:rPr>
         <w:br/>
         <w:t xml:space="preserve">    {</w:t>
       </w:r>
       <w:r>
-        <w:br/>
-      </w:r>
-      <w:r>
+        <w:rPr>
+          <w:lang w:val="en-US"/>
+        </w:rPr>
+        <w:br/>
+      </w:r>
+      <w:r>
+        <w:rPr>
+          <w:lang w:val="en-US"/>
+        </w:rPr>
         <w:lastRenderedPageBreak/>
         <w:t xml:space="preserve">        </w:t>
       </w:r>
       <w:proofErr w:type="spellStart"/>
       <w:r>
+        <w:rPr>
+          <w:lang w:val="en-US"/>
+        </w:rPr>
         <w:t>System.err.println</w:t>
       </w:r>
       <w:proofErr w:type="spellEnd"/>
       <w:r>
+        <w:rPr>
+          <w:lang w:val="en-US"/>
+        </w:rPr>
         <w:t>("Error reading file: " + file);</w:t>
       </w:r>
       <w:r>
+        <w:rPr>
+          <w:lang w:val="en-US"/>
+        </w:rPr>
         <w:br/>
         <w:t xml:space="preserve">        </w:t>
       </w:r>
       <w:proofErr w:type="spellStart"/>
       <w:r>
+        <w:rPr>
+          <w:lang w:val="en-US"/>
+        </w:rPr>
         <w:t>System.err.println</w:t>
       </w:r>
       <w:proofErr w:type="spellEnd"/>
       <w:r>
+        <w:rPr>
+          <w:lang w:val="en-US"/>
+        </w:rPr>
         <w:t>(</w:t>
       </w:r>
       <w:proofErr w:type="spellStart"/>
       <w:r>
+        <w:rPr>
+          <w:lang w:val="en-US"/>
+        </w:rPr>
         <w:t>e.getMessage</w:t>
       </w:r>
       <w:proofErr w:type="spellEnd"/>
       <w:r>
+        <w:rPr>
+          <w:lang w:val="en-US"/>
+        </w:rPr>
         <w:t>());</w:t>
       </w:r>
       <w:r>
+        <w:rPr>
+          <w:lang w:val="en-US"/>
+        </w:rPr>
         <w:br/>
         <w:t xml:space="preserve">        </w:t>
       </w:r>
       <w:proofErr w:type="spellStart"/>
       <w:r>
+        <w:rPr>
+          <w:lang w:val="en-US"/>
+        </w:rPr>
         <w:t>System.err.println</w:t>
       </w:r>
       <w:proofErr w:type="spellEnd"/>
       <w:r>
-        <w:t>("Make sure the file exists and is accessible. Program will exit."</w:t>
-      </w:r>
-      <w:proofErr w:type="gramStart"/>
-      <w:r>
-        <w:t>);</w:t>
-      </w:r>
-      <w:proofErr w:type="gramEnd"/>
-      <w:r>
+        <w:rPr>
+          <w:lang w:val="en-US"/>
+        </w:rPr>
+        <w:t>("Make sure the file exists and is accessible. Program will exit.");</w:t>
+      </w:r>
+      <w:r>
+        <w:rPr>
+          <w:lang w:val="en-US"/>
+        </w:rPr>
         <w:br/>
         <w:t xml:space="preserve">        </w:t>
       </w:r>
       <w:proofErr w:type="spellStart"/>
       <w:r>
+        <w:rPr>
+          <w:lang w:val="en-US"/>
+        </w:rPr>
         <w:t>System.exit</w:t>
       </w:r>
       <w:proofErr w:type="spellEnd"/>
       <w:r>
-        <w:t>(1</w:t>
-      </w:r>
-      <w:proofErr w:type="gramStart"/>
-      <w:r>
-        <w:t>);</w:t>
-      </w:r>
-      <w:proofErr w:type="gramEnd"/>
-      <w:r>
-        <w:br/>
-        <w:t xml:space="preserve">  </w:t>
-      </w:r>
-      <w:proofErr w:type="gramStart"/>
-      <w:r>
-        <w:t xml:space="preserve">  }</w:t>
-      </w:r>
-      <w:proofErr w:type="gramEnd"/>
-      <w:r>
-        <w:br/>
-      </w:r>
-      <w:r>
-        <w:br/>
-        <w:t xml:space="preserve">    return </w:t>
-      </w:r>
-      <w:proofErr w:type="gramStart"/>
-      <w:r>
-        <w:t>words;</w:t>
-      </w:r>
-      <w:proofErr w:type="gramEnd"/>
-      <w:r>
+        <w:rPr>
+          <w:lang w:val="en-US"/>
+        </w:rPr>
+        <w:t>(1);</w:t>
+      </w:r>
+      <w:r>
+        <w:rPr>
+          <w:lang w:val="en-US"/>
+        </w:rPr>
+        <w:br/>
+        <w:t xml:space="preserve">    }</w:t>
+      </w:r>
+      <w:r>
+        <w:rPr>
+          <w:lang w:val="en-US"/>
+        </w:rPr>
+        <w:br/>
+      </w:r>
+      <w:r>
+        <w:rPr>
+          <w:lang w:val="en-US"/>
+        </w:rPr>
+        <w:br/>
+        <w:t xml:space="preserve">    return words;</w:t>
+      </w:r>
+      <w:r>
+        <w:rPr>
+          <w:lang w:val="en-US"/>
+        </w:rPr>
         <w:br/>
         <w:t>}</w:t>
       </w:r>
@@ -2783,107 +2960,152 @@
     <w:p>
       <w:pPr>
         <w:pStyle w:val="Pseoudocode"/>
-      </w:pPr>
-      <w:r>
+        <w:rPr>
+          <w:lang w:val="en-US"/>
+        </w:rPr>
+      </w:pPr>
+      <w:r>
+        <w:rPr>
+          <w:lang w:val="en-US"/>
+        </w:rPr>
         <w:t>/**</w:t>
       </w:r>
       <w:r>
+        <w:rPr>
+          <w:lang w:val="en-US"/>
+        </w:rPr>
         <w:br/>
         <w:t xml:space="preserve"> * Global class to store valid Wordle words.</w:t>
       </w:r>
       <w:r>
+        <w:rPr>
+          <w:lang w:val="en-US"/>
+        </w:rPr>
         <w:br/>
         <w:t xml:space="preserve"> */</w:t>
       </w:r>
       <w:r>
+        <w:rPr>
+          <w:lang w:val="en-US"/>
+        </w:rPr>
         <w:br/>
         <w:t>public class Words</w:t>
       </w:r>
       <w:r>
+        <w:rPr>
+          <w:lang w:val="en-US"/>
+        </w:rPr>
         <w:br/>
         <w:t>{</w:t>
       </w:r>
       <w:r>
+        <w:rPr>
+          <w:lang w:val="en-US"/>
+        </w:rPr>
         <w:br/>
         <w:t xml:space="preserve">    /**</w:t>
       </w:r>
       <w:r>
+        <w:rPr>
+          <w:lang w:val="en-US"/>
+        </w:rPr>
         <w:br/>
         <w:t xml:space="preserve">     * List of valid Wordle solution words.</w:t>
       </w:r>
       <w:r>
+        <w:rPr>
+          <w:lang w:val="en-US"/>
+        </w:rPr>
         <w:br/>
         <w:t xml:space="preserve">     */</w:t>
       </w:r>
       <w:r>
+        <w:rPr>
+          <w:lang w:val="en-US"/>
+        </w:rPr>
         <w:br/>
         <w:t xml:space="preserve">    public static List&lt;String&gt; </w:t>
       </w:r>
       <w:proofErr w:type="spellStart"/>
       <w:r>
+        <w:rPr>
+          <w:lang w:val="en-US"/>
+        </w:rPr>
         <w:t>validSolutions</w:t>
       </w:r>
       <w:proofErr w:type="spellEnd"/>
       <w:r>
+        <w:rPr>
+          <w:lang w:val="en-US"/>
+        </w:rPr>
         <w:t xml:space="preserve"> = new </w:t>
       </w:r>
       <w:proofErr w:type="spellStart"/>
       <w:r>
+        <w:rPr>
+          <w:lang w:val="en-US"/>
+        </w:rPr>
         <w:t>ArrayList</w:t>
       </w:r>
       <w:proofErr w:type="spellEnd"/>
       <w:r>
-        <w:t>&lt;String</w:t>
-      </w:r>
-      <w:proofErr w:type="gramStart"/>
-      <w:r>
-        <w:t>&gt;(</w:t>
-      </w:r>
-      <w:proofErr w:type="gramEnd"/>
-      <w:r>
-        <w:t>);</w:t>
-      </w:r>
-      <w:r>
-        <w:br/>
-      </w:r>
-      <w:r>
+        <w:rPr>
+          <w:lang w:val="en-US"/>
+        </w:rPr>
+        <w:t>&lt;String&gt;();</w:t>
+      </w:r>
+      <w:r>
+        <w:rPr>
+          <w:lang w:val="en-US"/>
+        </w:rPr>
+        <w:br/>
+      </w:r>
+      <w:r>
+        <w:rPr>
+          <w:lang w:val="en-US"/>
+        </w:rPr>
         <w:br/>
         <w:t xml:space="preserve">    /**</w:t>
       </w:r>
       <w:r>
-        <w:br/>
-        <w:t xml:space="preserve">     * Set of valid Wordle guess words. Using a set for </w:t>
-      </w:r>
-      <w:proofErr w:type="gramStart"/>
-      <w:r>
-        <w:t>O(</w:t>
-      </w:r>
-      <w:proofErr w:type="gramEnd"/>
-      <w:r>
-        <w:t>1) lookup time.</w:t>
-      </w:r>
-      <w:r>
+        <w:rPr>
+          <w:lang w:val="en-US"/>
+        </w:rPr>
+        <w:br/>
+        <w:t xml:space="preserve">     * Set of valid Wordle guess words. Using a set for O(1) lookup time.</w:t>
+      </w:r>
+      <w:r>
+        <w:rPr>
+          <w:lang w:val="en-US"/>
+        </w:rPr>
         <w:br/>
         <w:t xml:space="preserve">     */</w:t>
       </w:r>
       <w:r>
+        <w:rPr>
+          <w:lang w:val="en-US"/>
+        </w:rPr>
         <w:br/>
         <w:t xml:space="preserve">    public static Set&lt;String&gt; </w:t>
       </w:r>
       <w:proofErr w:type="spellStart"/>
       <w:r>
+        <w:rPr>
+          <w:lang w:val="en-US"/>
+        </w:rPr>
         <w:t>validGuesses</w:t>
       </w:r>
       <w:proofErr w:type="spellEnd"/>
       <w:r>
-        <w:t xml:space="preserve"> = new HashSet&lt;</w:t>
-      </w:r>
-      <w:proofErr w:type="gramStart"/>
-      <w:r>
-        <w:t>&gt;();</w:t>
-      </w:r>
-      <w:proofErr w:type="gramEnd"/>
-      <w:r>
+        <w:rPr>
+          <w:lang w:val="en-US"/>
+        </w:rPr>
+        <w:t xml:space="preserve"> = new HashSet&lt;&gt;();</w:t>
+      </w:r>
+      <w:r>
+        <w:rPr>
+          <w:lang w:val="en-US"/>
+        </w:rPr>
         <w:br/>
         <w:t>}</w:t>
       </w:r>
@@ -2943,21 +3165,7 @@
         <w:rPr>
           <w:lang w:val="en-US"/>
         </w:rPr>
-        <w:t xml:space="preserve">public static void </w:t>
-      </w:r>
-      <w:proofErr w:type="gramStart"/>
-      <w:r>
-        <w:rPr>
-          <w:lang w:val="en-US"/>
-        </w:rPr>
-        <w:t>main(String[</w:t>
-      </w:r>
-      <w:proofErr w:type="gramEnd"/>
-      <w:r>
-        <w:rPr>
-          <w:lang w:val="en-US"/>
-        </w:rPr>
-        <w:t xml:space="preserve">] </w:t>
+        <w:t xml:space="preserve">public static void main(String[] </w:t>
       </w:r>
       <w:proofErr w:type="spellStart"/>
       <w:r>
@@ -3023,7 +3231,6 @@
         <w:t xml:space="preserve">    </w:t>
       </w:r>
       <w:proofErr w:type="spellStart"/>
-      <w:proofErr w:type="gramStart"/>
       <w:r>
         <w:rPr>
           <w:lang w:val="en-US"/>
@@ -3039,7 +3246,6 @@
         <w:t>println</w:t>
       </w:r>
       <w:proofErr w:type="spellEnd"/>
-      <w:proofErr w:type="gramEnd"/>
       <w:r>
         <w:rPr>
           <w:lang w:val="en-US"/>
@@ -3047,7 +3253,6 @@
         <w:t>(</w:t>
       </w:r>
       <w:proofErr w:type="spellStart"/>
-      <w:proofErr w:type="gramStart"/>
       <w:r>
         <w:rPr>
           <w:lang w:val="en-US"/>
@@ -3063,7 +3268,6 @@
         <w:t>validGuesses</w:t>
       </w:r>
       <w:proofErr w:type="spellEnd"/>
-      <w:proofErr w:type="gramEnd"/>
       <w:r>
         <w:rPr>
           <w:lang w:val="en-US"/>
@@ -3084,7 +3288,6 @@
         <w:t xml:space="preserve">    </w:t>
       </w:r>
       <w:proofErr w:type="spellStart"/>
-      <w:proofErr w:type="gramStart"/>
       <w:r>
         <w:rPr>
           <w:lang w:val="en-US"/>
@@ -3100,7 +3303,6 @@
         <w:t>println</w:t>
       </w:r>
       <w:proofErr w:type="spellEnd"/>
-      <w:proofErr w:type="gramEnd"/>
       <w:r>
         <w:rPr>
           <w:lang w:val="en-US"/>
@@ -3108,7 +3310,6 @@
         <w:t>(</w:t>
       </w:r>
       <w:proofErr w:type="spellStart"/>
-      <w:proofErr w:type="gramStart"/>
       <w:r>
         <w:rPr>
           <w:lang w:val="en-US"/>
@@ -3124,7 +3325,6 @@
         <w:t>validSolutions</w:t>
       </w:r>
       <w:proofErr w:type="spellEnd"/>
-      <w:proofErr w:type="gramEnd"/>
       <w:r>
         <w:rPr>
           <w:lang w:val="en-US"/>
@@ -3302,8 +3502,11 @@
         </mc:AlternateContent>
       </w:r>
       <w:r>
+        <w:rPr>
+          <w:noProof/>
+        </w:rPr>
         <w:drawing>
-          <wp:anchor distT="0" distB="0" distL="114300" distR="114300" simplePos="0" relativeHeight="251662336" behindDoc="0" locked="0" layoutInCell="1" allowOverlap="1" wp14:anchorId="73066911" wp14:editId="5BD7798B">
+          <wp:anchor distT="0" distB="0" distL="114300" distR="114300" simplePos="0" relativeHeight="251662336" behindDoc="0" locked="0" layoutInCell="1" allowOverlap="1" wp14:anchorId="73066911" wp14:editId="09AEA75F">
             <wp:simplePos x="0" y="0"/>
             <wp:positionH relativeFrom="margin">
               <wp:align>left</wp:align>
@@ -3358,6 +3561,9 @@
         <w:keepNext/>
       </w:pPr>
       <w:r>
+        <w:rPr>
+          <w:noProof/>
+        </w:rPr>
         <w:drawing>
           <wp:inline distT="0" distB="0" distL="0" distR="0" wp14:anchorId="25687EEA" wp14:editId="16DD986B">
             <wp:extent cx="5182870" cy="1450340"/>
@@ -3465,6 +3671,57 @@
       <w:bookmarkEnd w:id="13"/>
     </w:p>
     <w:p>
+      <w:r>
+        <w:t xml:space="preserve">First, I created a method that uses </w:t>
+      </w:r>
+      <w:proofErr w:type="spellStart"/>
+      <w:r>
+        <w:t>IO.readln</w:t>
+      </w:r>
+      <w:proofErr w:type="spellEnd"/>
+      <w:r>
+        <w:t xml:space="preserve"> </w:t>
+      </w:r>
+      <w:r>
+        <w:t xml:space="preserve">to read in a String, if the String is empty, longer than </w:t>
+      </w:r>
+      <w:proofErr w:type="spellStart"/>
+      <w:r>
+        <w:t>maxLength</w:t>
+      </w:r>
+      <w:proofErr w:type="spellEnd"/>
+      <w:r>
+        <w:t xml:space="preserve"> or shorter than </w:t>
+      </w:r>
+      <w:proofErr w:type="spellStart"/>
+      <w:r>
+        <w:t>minLength</w:t>
+      </w:r>
+      <w:proofErr w:type="spellEnd"/>
+      <w:r>
+        <w:t xml:space="preserve">, it </w:t>
+      </w:r>
+      <w:proofErr w:type="spellStart"/>
+      <w:r>
+        <w:t>reprompts</w:t>
+      </w:r>
+      <w:proofErr w:type="spellEnd"/>
+      <w:r>
+        <w:t xml:space="preserve"> the user to enter their input. </w:t>
+      </w:r>
+      <w:r>
+        <w:t xml:space="preserve">Inside the </w:t>
+      </w:r>
+      <w:proofErr w:type="spellStart"/>
+      <w:r>
+        <w:t>enterGuess</w:t>
+      </w:r>
+      <w:proofErr w:type="spellEnd"/>
+      <w:r>
+        <w:t xml:space="preserve"> method there’s a check, that looks up if the entered guess is contained inside the guess HashSet.</w:t>
+      </w:r>
+    </w:p>
+    <w:p>
       <w:pPr>
         <w:pStyle w:val="Heading2"/>
       </w:pPr>
@@ -3476,6 +3733,1032 @@
     </w:p>
     <w:p>
       <w:pPr>
+        <w:pStyle w:val="Pseoudocode"/>
+      </w:pPr>
+      <w:r>
+        <w:t>/**</w:t>
+      </w:r>
+      <w:r>
+        <w:br/>
+        <w:t xml:space="preserve"> * Gets a string input from the player with minimum and maximum length restrictions.</w:t>
+      </w:r>
+      <w:r>
+        <w:br/>
+        <w:t xml:space="preserve"> * Continues to prompt until valid input is provided.</w:t>
+      </w:r>
+      <w:r>
+        <w:br/>
+        <w:t xml:space="preserve"> *</w:t>
+      </w:r>
+      <w:r>
+        <w:br/>
+        <w:t xml:space="preserve"> * @param prompt    The prompt message to display</w:t>
+      </w:r>
+      <w:r>
+        <w:br/>
+        <w:t xml:space="preserve"> * @param </w:t>
+      </w:r>
+      <w:proofErr w:type="spellStart"/>
+      <w:r>
+        <w:t>minLength</w:t>
+      </w:r>
+      <w:proofErr w:type="spellEnd"/>
+      <w:r>
+        <w:t xml:space="preserve"> The minimum allowed length of the input</w:t>
+      </w:r>
+      <w:r>
+        <w:br/>
+        <w:t xml:space="preserve"> * @param </w:t>
+      </w:r>
+      <w:proofErr w:type="spellStart"/>
+      <w:r>
+        <w:t>maxLength</w:t>
+      </w:r>
+      <w:proofErr w:type="spellEnd"/>
+      <w:r>
+        <w:t xml:space="preserve"> The maximum allowed length of the input</w:t>
+      </w:r>
+      <w:r>
+        <w:br/>
+        <w:t xml:space="preserve"> * @return The validated string input</w:t>
+      </w:r>
+      <w:r>
+        <w:br/>
+        <w:t xml:space="preserve"> */</w:t>
+      </w:r>
+      <w:r>
+        <w:br/>
+        <w:t xml:space="preserve">public static String </w:t>
+      </w:r>
+      <w:proofErr w:type="spellStart"/>
+      <w:r>
+        <w:t>getStringInput</w:t>
+      </w:r>
+      <w:proofErr w:type="spellEnd"/>
+      <w:r>
+        <w:t xml:space="preserve">(String prompt, int </w:t>
+      </w:r>
+      <w:proofErr w:type="spellStart"/>
+      <w:r>
+        <w:t>minLength</w:t>
+      </w:r>
+      <w:proofErr w:type="spellEnd"/>
+      <w:r>
+        <w:t xml:space="preserve">, int </w:t>
+      </w:r>
+      <w:proofErr w:type="spellStart"/>
+      <w:r>
+        <w:t>maxLength</w:t>
+      </w:r>
+      <w:proofErr w:type="spellEnd"/>
+      <w:r>
+        <w:t>)</w:t>
+      </w:r>
+      <w:r>
+        <w:br/>
+        <w:t>{</w:t>
+      </w:r>
+      <w:r>
+        <w:br/>
+        <w:t xml:space="preserve">    while (true)</w:t>
+      </w:r>
+      <w:r>
+        <w:br/>
+        <w:t xml:space="preserve">    {</w:t>
+      </w:r>
+      <w:r>
+        <w:br/>
+        <w:t xml:space="preserve">        </w:t>
+      </w:r>
+      <w:proofErr w:type="spellStart"/>
+      <w:r>
+        <w:t>IO.println</w:t>
+      </w:r>
+      <w:proofErr w:type="spellEnd"/>
+      <w:r>
+        <w:t>(prompt + ": ");</w:t>
+      </w:r>
+      <w:r>
+        <w:br/>
+        <w:t xml:space="preserve">        String input = </w:t>
+      </w:r>
+      <w:proofErr w:type="spellStart"/>
+      <w:r>
+        <w:t>IO.readln</w:t>
+      </w:r>
+      <w:proofErr w:type="spellEnd"/>
+      <w:r>
+        <w:t>().trim();;</w:t>
+      </w:r>
+      <w:r>
+        <w:br/>
+      </w:r>
+      <w:r>
+        <w:br/>
+        <w:t xml:space="preserve">        if (!</w:t>
+      </w:r>
+      <w:proofErr w:type="spellStart"/>
+      <w:r>
+        <w:t>input.isEmpty</w:t>
+      </w:r>
+      <w:proofErr w:type="spellEnd"/>
+      <w:r>
+        <w:t xml:space="preserve">() &amp;&amp; </w:t>
+      </w:r>
+      <w:proofErr w:type="spellStart"/>
+      <w:r>
+        <w:t>input.length</w:t>
+      </w:r>
+      <w:proofErr w:type="spellEnd"/>
+      <w:r>
+        <w:t xml:space="preserve">() &lt;= </w:t>
+      </w:r>
+      <w:proofErr w:type="spellStart"/>
+      <w:r>
+        <w:t>maxLength</w:t>
+      </w:r>
+      <w:proofErr w:type="spellEnd"/>
+      <w:r>
+        <w:t xml:space="preserve"> &amp;&amp; </w:t>
+      </w:r>
+      <w:proofErr w:type="spellStart"/>
+      <w:r>
+        <w:t>input.length</w:t>
+      </w:r>
+      <w:proofErr w:type="spellEnd"/>
+      <w:r>
+        <w:t xml:space="preserve">() &gt;= </w:t>
+      </w:r>
+      <w:proofErr w:type="spellStart"/>
+      <w:r>
+        <w:t>minLength</w:t>
+      </w:r>
+      <w:proofErr w:type="spellEnd"/>
+      <w:r>
+        <w:t>)</w:t>
+      </w:r>
+      <w:r>
+        <w:br/>
+        <w:t xml:space="preserve">        {</w:t>
+      </w:r>
+      <w:r>
+        <w:br/>
+        <w:t xml:space="preserve">            return input;</w:t>
+      </w:r>
+      <w:r>
+        <w:br/>
+        <w:t xml:space="preserve">        }</w:t>
+      </w:r>
+      <w:r>
+        <w:br/>
+      </w:r>
+      <w:r>
+        <w:br/>
+        <w:t xml:space="preserve">        if (</w:t>
+      </w:r>
+      <w:proofErr w:type="spellStart"/>
+      <w:r>
+        <w:t>input.length</w:t>
+      </w:r>
+      <w:proofErr w:type="spellEnd"/>
+      <w:r>
+        <w:t xml:space="preserve">() &gt; </w:t>
+      </w:r>
+      <w:proofErr w:type="spellStart"/>
+      <w:r>
+        <w:t>maxLength</w:t>
+      </w:r>
+      <w:proofErr w:type="spellEnd"/>
+      <w:r>
+        <w:t>)</w:t>
+      </w:r>
+      <w:r>
+        <w:br/>
+        <w:t xml:space="preserve">        {</w:t>
+      </w:r>
+      <w:r>
+        <w:br/>
+        <w:t xml:space="preserve">            </w:t>
+      </w:r>
+      <w:proofErr w:type="spellStart"/>
+      <w:r>
+        <w:t>printlnRed</w:t>
+      </w:r>
+      <w:proofErr w:type="spellEnd"/>
+      <w:r>
+        <w:t xml:space="preserve">("Input exceeds maximum length of " + </w:t>
+      </w:r>
+      <w:proofErr w:type="spellStart"/>
+      <w:r>
+        <w:t>maxLength</w:t>
+      </w:r>
+      <w:proofErr w:type="spellEnd"/>
+      <w:r>
+        <w:t xml:space="preserve"> + " characters. Please try again.");</w:t>
+      </w:r>
+      <w:r>
+        <w:br/>
+        <w:t xml:space="preserve">        }</w:t>
+      </w:r>
+      <w:r>
+        <w:br/>
+        <w:t xml:space="preserve">        else if (</w:t>
+      </w:r>
+      <w:proofErr w:type="spellStart"/>
+      <w:r>
+        <w:t>input.length</w:t>
+      </w:r>
+      <w:proofErr w:type="spellEnd"/>
+      <w:r>
+        <w:t xml:space="preserve">() &lt; </w:t>
+      </w:r>
+      <w:proofErr w:type="spellStart"/>
+      <w:r>
+        <w:t>minLength</w:t>
+      </w:r>
+      <w:proofErr w:type="spellEnd"/>
+      <w:r>
+        <w:t>)</w:t>
+      </w:r>
+      <w:r>
+        <w:br/>
+      </w:r>
+      <w:r>
+        <w:lastRenderedPageBreak/>
+        <w:t xml:space="preserve">        {</w:t>
+      </w:r>
+      <w:r>
+        <w:br/>
+        <w:t xml:space="preserve">            </w:t>
+      </w:r>
+      <w:proofErr w:type="spellStart"/>
+      <w:r>
+        <w:t>printlnRed</w:t>
+      </w:r>
+      <w:proofErr w:type="spellEnd"/>
+      <w:r>
+        <w:t xml:space="preserve">("Input must be at least " + </w:t>
+      </w:r>
+      <w:proofErr w:type="spellStart"/>
+      <w:r>
+        <w:t>minLength</w:t>
+      </w:r>
+      <w:proofErr w:type="spellEnd"/>
+      <w:r>
+        <w:t xml:space="preserve"> + " characters long. Please try again.");</w:t>
+      </w:r>
+      <w:r>
+        <w:br/>
+        <w:t xml:space="preserve">        }</w:t>
+      </w:r>
+      <w:r>
+        <w:br/>
+        <w:t xml:space="preserve">        else</w:t>
+      </w:r>
+      <w:r>
+        <w:br/>
+        <w:t xml:space="preserve">        {</w:t>
+      </w:r>
+      <w:r>
+        <w:br/>
+        <w:t xml:space="preserve">            </w:t>
+      </w:r>
+      <w:proofErr w:type="spellStart"/>
+      <w:r>
+        <w:t>printlnRed</w:t>
+      </w:r>
+      <w:proofErr w:type="spellEnd"/>
+      <w:r>
+        <w:t>("Input cannot be empty. Please try again.");</w:t>
+      </w:r>
+      <w:r>
+        <w:br/>
+        <w:t xml:space="preserve">        }</w:t>
+      </w:r>
+      <w:r>
+        <w:br/>
+        <w:t xml:space="preserve">    }</w:t>
+      </w:r>
+      <w:r>
+        <w:br/>
+        <w:t>}</w:t>
+      </w:r>
+    </w:p>
+    <w:p>
+      <w:pPr>
+        <w:pStyle w:val="Caption"/>
+      </w:pPr>
+      <w:r>
+        <w:t xml:space="preserve">Figure </w:t>
+      </w:r>
+      <w:r>
+        <w:fldChar w:fldCharType="begin"/>
+      </w:r>
+      <w:r>
+        <w:instrText xml:space="preserve"> SEQ Figure \* ARABIC </w:instrText>
+      </w:r>
+      <w:r>
+        <w:fldChar w:fldCharType="separate"/>
+      </w:r>
+      <w:r>
+        <w:rPr>
+          <w:noProof/>
+        </w:rPr>
+        <w:t>6</w:t>
+      </w:r>
+      <w:r>
+        <w:fldChar w:fldCharType="end"/>
+      </w:r>
+      <w:r>
+        <w:t xml:space="preserve">: </w:t>
+      </w:r>
+      <w:proofErr w:type="spellStart"/>
+      <w:r>
+        <w:t>getStringInput</w:t>
+      </w:r>
+      <w:proofErr w:type="spellEnd"/>
+      <w:r>
+        <w:t xml:space="preserve"> Method</w:t>
+      </w:r>
+    </w:p>
+    <w:p/>
+    <w:p>
+      <w:pPr>
+        <w:pStyle w:val="Pseoudocode"/>
+        <w:rPr>
+          <w:lang w:val="en-US"/>
+        </w:rPr>
+      </w:pPr>
+      <w:r>
+        <w:rPr>
+          <w:lang w:val="en-US"/>
+        </w:rPr>
+        <w:t xml:space="preserve">private </w:t>
+      </w:r>
+      <w:proofErr w:type="spellStart"/>
+      <w:r>
+        <w:rPr>
+          <w:lang w:val="en-US"/>
+        </w:rPr>
+        <w:t>boolean</w:t>
+      </w:r>
+      <w:proofErr w:type="spellEnd"/>
+      <w:r>
+        <w:rPr>
+          <w:lang w:val="en-US"/>
+        </w:rPr>
+        <w:t xml:space="preserve"> </w:t>
+      </w:r>
+      <w:proofErr w:type="spellStart"/>
+      <w:r>
+        <w:rPr>
+          <w:lang w:val="en-US"/>
+        </w:rPr>
+        <w:t>validateGuess</w:t>
+      </w:r>
+      <w:proofErr w:type="spellEnd"/>
+      <w:r>
+        <w:rPr>
+          <w:lang w:val="en-US"/>
+        </w:rPr>
+        <w:t>(String guess)</w:t>
+      </w:r>
+      <w:r>
+        <w:rPr>
+          <w:lang w:val="en-US"/>
+        </w:rPr>
+        <w:br/>
+        <w:t>{</w:t>
+      </w:r>
+      <w:r>
+        <w:rPr>
+          <w:lang w:val="en-US"/>
+        </w:rPr>
+        <w:br/>
+        <w:t xml:space="preserve">    return </w:t>
+      </w:r>
+      <w:proofErr w:type="spellStart"/>
+      <w:r>
+        <w:rPr>
+          <w:lang w:val="en-US"/>
+        </w:rPr>
+        <w:t>Words.</w:t>
+      </w:r>
+      <w:r>
+        <w:rPr>
+          <w:i/>
+          <w:iCs/>
+          <w:lang w:val="en-US"/>
+        </w:rPr>
+        <w:t>validGuesses</w:t>
+      </w:r>
+      <w:r>
+        <w:rPr>
+          <w:lang w:val="en-US"/>
+        </w:rPr>
+        <w:t>.contains</w:t>
+      </w:r>
+      <w:proofErr w:type="spellEnd"/>
+      <w:r>
+        <w:rPr>
+          <w:lang w:val="en-US"/>
+        </w:rPr>
+        <w:t>(guess);</w:t>
+      </w:r>
+      <w:r>
+        <w:rPr>
+          <w:lang w:val="en-US"/>
+        </w:rPr>
+        <w:br/>
+        <w:t>}</w:t>
+      </w:r>
+    </w:p>
+    <w:p>
+      <w:pPr>
+        <w:pStyle w:val="Caption"/>
+        <w:rPr>
+          <w:lang w:val="en-AT"/>
+        </w:rPr>
+      </w:pPr>
+      <w:r>
+        <w:t xml:space="preserve">Figure </w:t>
+      </w:r>
+      <w:r>
+        <w:fldChar w:fldCharType="begin"/>
+      </w:r>
+      <w:r>
+        <w:instrText xml:space="preserve"> SEQ Figure \* ARABIC </w:instrText>
+      </w:r>
+      <w:r>
+        <w:fldChar w:fldCharType="separate"/>
+      </w:r>
+      <w:r>
+        <w:rPr>
+          <w:noProof/>
+        </w:rPr>
+        <w:t>7</w:t>
+      </w:r>
+      <w:r>
+        <w:fldChar w:fldCharType="end"/>
+      </w:r>
+      <w:r>
+        <w:t xml:space="preserve">: </w:t>
+      </w:r>
+      <w:proofErr w:type="spellStart"/>
+      <w:r>
+        <w:t>validateGuess</w:t>
+      </w:r>
+      <w:proofErr w:type="spellEnd"/>
+      <w:r>
+        <w:t xml:space="preserve"> Method</w:t>
+      </w:r>
+    </w:p>
+    <w:p>
+      <w:pPr>
+        <w:pStyle w:val="Pseoudocode"/>
+        <w:rPr>
+          <w:lang w:val="en-AT"/>
+        </w:rPr>
+      </w:pPr>
+      <w:r>
+        <w:rPr>
+          <w:lang w:val="en-US"/>
+        </w:rPr>
+        <w:t xml:space="preserve">private Guess </w:t>
+      </w:r>
+      <w:proofErr w:type="spellStart"/>
+      <w:r>
+        <w:rPr>
+          <w:lang w:val="en-US"/>
+        </w:rPr>
+        <w:t>enterGuess</w:t>
+      </w:r>
+      <w:proofErr w:type="spellEnd"/>
+      <w:r>
+        <w:rPr>
+          <w:lang w:val="en-US"/>
+        </w:rPr>
+        <w:t>()</w:t>
+      </w:r>
+      <w:r>
+        <w:rPr>
+          <w:lang w:val="en-US"/>
+        </w:rPr>
+        <w:br/>
+        <w:t>{</w:t>
+      </w:r>
+      <w:r>
+        <w:rPr>
+          <w:lang w:val="en-US"/>
+        </w:rPr>
+        <w:br/>
+        <w:t xml:space="preserve">    do</w:t>
+      </w:r>
+      <w:r>
+        <w:rPr>
+          <w:lang w:val="en-US"/>
+        </w:rPr>
+        <w:br/>
+        <w:t xml:space="preserve">    {</w:t>
+      </w:r>
+      <w:r>
+        <w:rPr>
+          <w:lang w:val="en-US"/>
+        </w:rPr>
+        <w:br/>
+        <w:t xml:space="preserve">        String </w:t>
+      </w:r>
+      <w:proofErr w:type="spellStart"/>
+      <w:r>
+        <w:rPr>
+          <w:lang w:val="en-US"/>
+        </w:rPr>
+        <w:t>currentGuess</w:t>
+      </w:r>
+      <w:proofErr w:type="spellEnd"/>
+      <w:r>
+        <w:rPr>
+          <w:lang w:val="en-US"/>
+        </w:rPr>
+        <w:t xml:space="preserve"> = </w:t>
+      </w:r>
+      <w:proofErr w:type="spellStart"/>
+      <w:r>
+        <w:rPr>
+          <w:lang w:val="en-US"/>
+        </w:rPr>
+        <w:t>UI.</w:t>
+      </w:r>
+      <w:r>
+        <w:rPr>
+          <w:i/>
+          <w:iCs/>
+          <w:lang w:val="en-US"/>
+        </w:rPr>
+        <w:t>getStringInput</w:t>
+      </w:r>
+      <w:proofErr w:type="spellEnd"/>
+      <w:r>
+        <w:rPr>
+          <w:lang w:val="en-US"/>
+        </w:rPr>
+        <w:t xml:space="preserve">("Enter your Guess", </w:t>
+      </w:r>
+      <w:proofErr w:type="spellStart"/>
+      <w:r>
+        <w:rPr>
+          <w:lang w:val="en-AT"/>
+        </w:rPr>
+        <w:t>Config.</w:t>
+      </w:r>
+      <w:r>
+        <w:rPr>
+          <w:i/>
+          <w:iCs/>
+          <w:lang w:val="en-AT"/>
+        </w:rPr>
+        <w:t>MAX_WORD_LENGTH</w:t>
+      </w:r>
+      <w:proofErr w:type="spellEnd"/>
+      <w:r>
+        <w:rPr>
+          <w:lang w:val="en-AT"/>
+        </w:rPr>
+        <w:t xml:space="preserve">, </w:t>
+      </w:r>
+      <w:proofErr w:type="spellStart"/>
+      <w:r>
+        <w:rPr>
+          <w:lang w:val="en-AT"/>
+        </w:rPr>
+        <w:t>Config.</w:t>
+      </w:r>
+      <w:r>
+        <w:rPr>
+          <w:i/>
+          <w:iCs/>
+          <w:lang w:val="en-AT"/>
+        </w:rPr>
+        <w:t>MAX_WORD_LENGTH</w:t>
+      </w:r>
+      <w:proofErr w:type="spellEnd"/>
+    </w:p>
+    <w:p>
+      <w:pPr>
+        <w:pStyle w:val="Pseoudocode"/>
+      </w:pPr>
+      <w:r>
+        <w:rPr>
+          <w:lang w:val="en-US"/>
+        </w:rPr>
+        <w:t>).</w:t>
+      </w:r>
+      <w:proofErr w:type="spellStart"/>
+      <w:r>
+        <w:rPr>
+          <w:lang w:val="en-US"/>
+        </w:rPr>
+        <w:t>toUpperCase</w:t>
+      </w:r>
+      <w:proofErr w:type="spellEnd"/>
+      <w:r>
+        <w:rPr>
+          <w:lang w:val="en-US"/>
+        </w:rPr>
+        <w:t>();</w:t>
+      </w:r>
+      <w:r>
+        <w:rPr>
+          <w:lang w:val="en-US"/>
+        </w:rPr>
+        <w:br/>
+      </w:r>
+      <w:r>
+        <w:rPr>
+          <w:lang w:val="en-US"/>
+        </w:rPr>
+        <w:br/>
+        <w:t xml:space="preserve">        if (</w:t>
+      </w:r>
+      <w:proofErr w:type="spellStart"/>
+      <w:r>
+        <w:rPr>
+          <w:lang w:val="en-US"/>
+        </w:rPr>
+        <w:t>currentGuess.equals</w:t>
+      </w:r>
+      <w:proofErr w:type="spellEnd"/>
+      <w:r>
+        <w:rPr>
+          <w:lang w:val="en-US"/>
+        </w:rPr>
+        <w:t>(</w:t>
+      </w:r>
+      <w:proofErr w:type="spellStart"/>
+      <w:r>
+        <w:rPr>
+          <w:lang w:val="en-US"/>
+        </w:rPr>
+        <w:t>Config.</w:t>
+      </w:r>
+      <w:r>
+        <w:rPr>
+          <w:i/>
+          <w:iCs/>
+          <w:lang w:val="en-US"/>
+        </w:rPr>
+        <w:t>EXIT_COMMAND</w:t>
+      </w:r>
+      <w:proofErr w:type="spellEnd"/>
+      <w:r>
+        <w:rPr>
+          <w:lang w:val="en-US"/>
+        </w:rPr>
+        <w:t>))</w:t>
+      </w:r>
+      <w:r>
+        <w:rPr>
+          <w:lang w:val="en-US"/>
+        </w:rPr>
+        <w:br/>
+        <w:t xml:space="preserve">        {</w:t>
+      </w:r>
+      <w:r>
+        <w:rPr>
+          <w:lang w:val="en-US"/>
+        </w:rPr>
+        <w:br/>
+        <w:t xml:space="preserve">            return new Guess("EXIT!", new </w:t>
+      </w:r>
+      <w:proofErr w:type="spellStart"/>
+      <w:r>
+        <w:rPr>
+          <w:lang w:val="en-US"/>
+        </w:rPr>
+        <w:t>GuessAccuracy</w:t>
+      </w:r>
+      <w:proofErr w:type="spellEnd"/>
+      <w:r>
+        <w:rPr>
+          <w:lang w:val="en-US"/>
+        </w:rPr>
+        <w:t>[0]);</w:t>
+      </w:r>
+      <w:r>
+        <w:rPr>
+          <w:lang w:val="en-US"/>
+        </w:rPr>
+        <w:br/>
+        <w:t xml:space="preserve">        }</w:t>
+      </w:r>
+      <w:r>
+        <w:rPr>
+          <w:lang w:val="en-US"/>
+        </w:rPr>
+        <w:br/>
+        <w:t xml:space="preserve">        else if (</w:t>
+      </w:r>
+      <w:proofErr w:type="spellStart"/>
+      <w:r>
+        <w:rPr>
+          <w:lang w:val="en-US"/>
+        </w:rPr>
+        <w:t>currentGuess.equals</w:t>
+      </w:r>
+      <w:proofErr w:type="spellEnd"/>
+      <w:r>
+        <w:rPr>
+          <w:lang w:val="en-US"/>
+        </w:rPr>
+        <w:t>(</w:t>
+      </w:r>
+      <w:proofErr w:type="spellStart"/>
+      <w:r>
+        <w:rPr>
+          <w:lang w:val="en-US"/>
+        </w:rPr>
+        <w:t>Config.</w:t>
+      </w:r>
+      <w:r>
+        <w:rPr>
+          <w:i/>
+          <w:iCs/>
+          <w:lang w:val="en-US"/>
+        </w:rPr>
+        <w:t>HELP_COMMAND</w:t>
+      </w:r>
+      <w:proofErr w:type="spellEnd"/>
+      <w:r>
+        <w:rPr>
+          <w:lang w:val="en-US"/>
+        </w:rPr>
+        <w:t>))</w:t>
+      </w:r>
+      <w:r>
+        <w:rPr>
+          <w:lang w:val="en-US"/>
+        </w:rPr>
+        <w:br/>
+        <w:t xml:space="preserve">        {</w:t>
+      </w:r>
+      <w:r>
+        <w:rPr>
+          <w:lang w:val="en-US"/>
+        </w:rPr>
+        <w:br/>
+        <w:t xml:space="preserve">           </w:t>
+      </w:r>
+      <w:proofErr w:type="spellStart"/>
+      <w:r>
+        <w:rPr>
+          <w:lang w:val="en-US"/>
+        </w:rPr>
+        <w:t>UI.</w:t>
+      </w:r>
+      <w:r>
+        <w:rPr>
+          <w:i/>
+          <w:iCs/>
+          <w:lang w:val="en-US"/>
+        </w:rPr>
+        <w:t>printlnRed</w:t>
+      </w:r>
+      <w:proofErr w:type="spellEnd"/>
+      <w:r>
+        <w:rPr>
+          <w:lang w:val="en-US"/>
+        </w:rPr>
+        <w:t>("Not implemented yet.");</w:t>
+      </w:r>
+      <w:r>
+        <w:rPr>
+          <w:lang w:val="en-US"/>
+        </w:rPr>
+        <w:br/>
+        <w:t xml:space="preserve">        }</w:t>
+      </w:r>
+      <w:r>
+        <w:rPr>
+          <w:lang w:val="en-US"/>
+        </w:rPr>
+        <w:br/>
+      </w:r>
+      <w:r>
+        <w:rPr>
+          <w:lang w:val="en-US"/>
+        </w:rPr>
+        <w:br/>
+        <w:t xml:space="preserve">        if (</w:t>
+      </w:r>
+      <w:proofErr w:type="spellStart"/>
+      <w:r>
+        <w:rPr>
+          <w:lang w:val="en-US"/>
+        </w:rPr>
+        <w:t>validateGuess</w:t>
+      </w:r>
+      <w:proofErr w:type="spellEnd"/>
+      <w:r>
+        <w:rPr>
+          <w:lang w:val="en-US"/>
+        </w:rPr>
+        <w:t>(</w:t>
+      </w:r>
+      <w:proofErr w:type="spellStart"/>
+      <w:r>
+        <w:rPr>
+          <w:lang w:val="en-US"/>
+        </w:rPr>
+        <w:t>currentGuess</w:t>
+      </w:r>
+      <w:proofErr w:type="spellEnd"/>
+      <w:r>
+        <w:rPr>
+          <w:lang w:val="en-US"/>
+        </w:rPr>
+        <w:t>))</w:t>
+      </w:r>
+      <w:r>
+        <w:rPr>
+          <w:lang w:val="en-US"/>
+        </w:rPr>
+        <w:br/>
+        <w:t xml:space="preserve">        {</w:t>
+      </w:r>
+      <w:r>
+        <w:rPr>
+          <w:lang w:val="en-US"/>
+        </w:rPr>
+        <w:br/>
+        <w:t xml:space="preserve">            return </w:t>
+      </w:r>
+      <w:proofErr w:type="spellStart"/>
+      <w:r>
+        <w:rPr>
+          <w:lang w:val="en-US"/>
+        </w:rPr>
+        <w:t>computeGuess</w:t>
+      </w:r>
+      <w:proofErr w:type="spellEnd"/>
+      <w:r>
+        <w:rPr>
+          <w:lang w:val="en-US"/>
+        </w:rPr>
+        <w:t>(</w:t>
+      </w:r>
+      <w:proofErr w:type="spellStart"/>
+      <w:r>
+        <w:rPr>
+          <w:lang w:val="en-US"/>
+        </w:rPr>
+        <w:t>currentGuess</w:t>
+      </w:r>
+      <w:proofErr w:type="spellEnd"/>
+      <w:r>
+        <w:rPr>
+          <w:lang w:val="en-US"/>
+        </w:rPr>
+        <w:t>);</w:t>
+      </w:r>
+      <w:r>
+        <w:rPr>
+          <w:lang w:val="en-US"/>
+        </w:rPr>
+        <w:br/>
+      </w:r>
+      <w:r>
+        <w:rPr>
+          <w:lang w:val="en-US"/>
+        </w:rPr>
+        <w:lastRenderedPageBreak/>
+        <w:t xml:space="preserve">        }</w:t>
+      </w:r>
+      <w:r>
+        <w:rPr>
+          <w:lang w:val="en-US"/>
+        </w:rPr>
+        <w:br/>
+        <w:t xml:space="preserve">        else</w:t>
+      </w:r>
+      <w:r>
+        <w:rPr>
+          <w:lang w:val="en-US"/>
+        </w:rPr>
+        <w:br/>
+        <w:t xml:space="preserve">        {</w:t>
+      </w:r>
+      <w:r>
+        <w:rPr>
+          <w:lang w:val="en-US"/>
+        </w:rPr>
+        <w:br/>
+        <w:t xml:space="preserve">            </w:t>
+      </w:r>
+      <w:proofErr w:type="spellStart"/>
+      <w:r>
+        <w:rPr>
+          <w:lang w:val="en-US"/>
+        </w:rPr>
+        <w:t>UI.</w:t>
+      </w:r>
+      <w:r>
+        <w:rPr>
+          <w:i/>
+          <w:iCs/>
+          <w:lang w:val="en-US"/>
+        </w:rPr>
+        <w:t>printlnRed</w:t>
+      </w:r>
+      <w:proofErr w:type="spellEnd"/>
+      <w:r>
+        <w:rPr>
+          <w:lang w:val="en-US"/>
+        </w:rPr>
+        <w:t xml:space="preserve">("Invalid Guess. </w:t>
+      </w:r>
+      <w:proofErr w:type="spellStart"/>
+      <w:r>
+        <w:t>Please</w:t>
+      </w:r>
+      <w:proofErr w:type="spellEnd"/>
+      <w:r>
+        <w:t xml:space="preserve"> </w:t>
+      </w:r>
+      <w:proofErr w:type="spellStart"/>
+      <w:r>
+        <w:t>try</w:t>
+      </w:r>
+      <w:proofErr w:type="spellEnd"/>
+      <w:r>
+        <w:t xml:space="preserve"> </w:t>
+      </w:r>
+      <w:proofErr w:type="spellStart"/>
+      <w:r>
+        <w:t>again</w:t>
+      </w:r>
+      <w:proofErr w:type="spellEnd"/>
+      <w:r>
+        <w:t>.");</w:t>
+      </w:r>
+      <w:r>
+        <w:br/>
+        <w:t xml:space="preserve">        }</w:t>
+      </w:r>
+      <w:r>
+        <w:br/>
+        <w:t xml:space="preserve">    }</w:t>
+      </w:r>
+      <w:r>
+        <w:br/>
+        <w:t xml:space="preserve">    while (true);</w:t>
+      </w:r>
+      <w:r>
+        <w:br/>
+        <w:t>}</w:t>
+      </w:r>
+    </w:p>
+    <w:p>
+      <w:pPr>
+        <w:pStyle w:val="Caption"/>
+        <w:rPr>
+          <w:lang w:val="en-AT"/>
+        </w:rPr>
+      </w:pPr>
+      <w:r>
+        <w:t xml:space="preserve">Figure </w:t>
+      </w:r>
+      <w:r>
+        <w:fldChar w:fldCharType="begin"/>
+      </w:r>
+      <w:r>
+        <w:instrText xml:space="preserve"> SEQ Figure \* ARABIC </w:instrText>
+      </w:r>
+      <w:r>
+        <w:fldChar w:fldCharType="separate"/>
+      </w:r>
+      <w:r>
+        <w:rPr>
+          <w:noProof/>
+        </w:rPr>
+        <w:t>8</w:t>
+      </w:r>
+      <w:r>
+        <w:fldChar w:fldCharType="end"/>
+      </w:r>
+      <w:r>
+        <w:t xml:space="preserve">: </w:t>
+      </w:r>
+      <w:proofErr w:type="spellStart"/>
+      <w:r>
+        <w:t>enterGuess</w:t>
+      </w:r>
+      <w:proofErr w:type="spellEnd"/>
+      <w:r>
+        <w:t xml:space="preserve"> Method</w:t>
+      </w:r>
+    </w:p>
+    <w:p>
+      <w:pPr>
         <w:pStyle w:val="Heading2"/>
       </w:pPr>
       <w:bookmarkStart w:id="15" w:name="_Toc217572533"/>
@@ -3483,6 +4766,225 @@
         <w:t>Test</w:t>
       </w:r>
       <w:bookmarkEnd w:id="15"/>
+    </w:p>
+    <w:p>
+      <w:r>
+        <w:rPr>
+          <w:noProof/>
+        </w:rPr>
+        <mc:AlternateContent>
+          <mc:Choice Requires="wps">
+            <w:drawing>
+              <wp:anchor distT="0" distB="0" distL="114300" distR="114300" simplePos="0" relativeHeight="251667456" behindDoc="0" locked="0" layoutInCell="1" allowOverlap="1" wp14:anchorId="7DA94ED0" wp14:editId="6054FBB3">
+                <wp:simplePos x="0" y="0"/>
+                <wp:positionH relativeFrom="column">
+                  <wp:posOffset>205740</wp:posOffset>
+                </wp:positionH>
+                <wp:positionV relativeFrom="paragraph">
+                  <wp:posOffset>2542540</wp:posOffset>
+                </wp:positionV>
+                <wp:extent cx="5182870" cy="635"/>
+                <wp:effectExtent l="0" t="0" r="0" b="0"/>
+                <wp:wrapTopAndBottom/>
+                <wp:docPr id="1611957624" name="Text Box 1"/>
+                <wp:cNvGraphicFramePr/>
+                <a:graphic xmlns:a="http://schemas.openxmlformats.org/drawingml/2006/main">
+                  <a:graphicData uri="http://schemas.microsoft.com/office/word/2010/wordprocessingShape">
+                    <wps:wsp>
+                      <wps:cNvSpPr txBox="1"/>
+                      <wps:spPr>
+                        <a:xfrm>
+                          <a:off x="0" y="0"/>
+                          <a:ext cx="5182870" cy="635"/>
+                        </a:xfrm>
+                        <a:prstGeom prst="rect">
+                          <a:avLst/>
+                        </a:prstGeom>
+                        <a:solidFill>
+                          <a:prstClr val="white"/>
+                        </a:solidFill>
+                        <a:ln>
+                          <a:noFill/>
+                        </a:ln>
+                      </wps:spPr>
+                      <wps:txbx>
+                        <w:txbxContent>
+                          <w:p>
+                            <w:pPr>
+                              <w:pStyle w:val="Caption"/>
+                            </w:pPr>
+                            <w:r>
+                              <w:t xml:space="preserve">Figure </w:t>
+                            </w:r>
+                            <w:r>
+                              <w:fldChar w:fldCharType="begin"/>
+                            </w:r>
+                            <w:r>
+                              <w:instrText xml:space="preserve"> SEQ Figure \* ARABIC </w:instrText>
+                            </w:r>
+                            <w:r>
+                              <w:fldChar w:fldCharType="separate"/>
+                            </w:r>
+                            <w:r>
+                              <w:rPr>
+                                <w:noProof/>
+                              </w:rPr>
+                              <w:t>9</w:t>
+                            </w:r>
+                            <w:r>
+                              <w:fldChar w:fldCharType="end"/>
+                            </w:r>
+                            <w:r>
+                              <w:t>: Guessing Tests</w:t>
+                            </w:r>
+                          </w:p>
+                        </w:txbxContent>
+                      </wps:txbx>
+                      <wps:bodyPr rot="0" spcFirstLastPara="0" vertOverflow="overflow" horzOverflow="overflow" vert="horz" wrap="square" lIns="0" tIns="0" rIns="0" bIns="0" numCol="1" spcCol="0" rtlCol="0" fromWordArt="0" anchor="t" anchorCtr="0" forceAA="0" compatLnSpc="1">
+                        <a:prstTxWarp prst="textNoShape">
+                          <a:avLst/>
+                        </a:prstTxWarp>
+                        <a:spAutoFit/>
+                      </wps:bodyPr>
+                    </wps:wsp>
+                  </a:graphicData>
+                </a:graphic>
+              </wp:anchor>
+            </w:drawing>
+          </mc:Choice>
+          <mc:Fallback>
+            <w:pict>
+              <v:shape w14:anchorId="7DA94ED0" id="_x0000_s1029" type="#_x0000_t202" style="position:absolute;left:0;text-align:left;margin-left:16.2pt;margin-top:200.2pt;width:408.1pt;height:.05pt;z-index:251667456;visibility:visible;mso-wrap-style:square;mso-wrap-distance-left:9pt;mso-wrap-distance-top:0;mso-wrap-distance-right:9pt;mso-wrap-distance-bottom:0;mso-position-horizontal:absolute;mso-position-horizontal-relative:text;mso-position-vertical:absolute;mso-position-vertical-relative:text;v-text-anchor:top" o:gfxdata="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" stroked="f">
+                <v:textbox style="mso-fit-shape-to-text:t" inset="0,0,0,0">
+                  <w:txbxContent>
+                    <w:p>
+                      <w:pPr>
+                        <w:pStyle w:val="Caption"/>
+                      </w:pPr>
+                      <w:r>
+                        <w:t xml:space="preserve">Figure </w:t>
+                      </w:r>
+                      <w:r>
+                        <w:fldChar w:fldCharType="begin"/>
+                      </w:r>
+                      <w:r>
+                        <w:instrText xml:space="preserve"> SEQ Figure \* ARABIC </w:instrText>
+                      </w:r>
+                      <w:r>
+                        <w:fldChar w:fldCharType="separate"/>
+                      </w:r>
+                      <w:r>
+                        <w:rPr>
+                          <w:noProof/>
+                        </w:rPr>
+                        <w:t>9</w:t>
+                      </w:r>
+                      <w:r>
+                        <w:fldChar w:fldCharType="end"/>
+                      </w:r>
+                      <w:r>
+                        <w:t>: Guessing Tests</w:t>
+                      </w:r>
+                    </w:p>
+                  </w:txbxContent>
+                </v:textbox>
+                <w10:wrap type="topAndBottom"/>
+              </v:shape>
+            </w:pict>
+          </mc:Fallback>
+        </mc:AlternateContent>
+      </w:r>
+      <w:r>
+        <w:drawing>
+          <wp:anchor distT="0" distB="0" distL="114300" distR="114300" simplePos="0" relativeHeight="251665408" behindDoc="0" locked="0" layoutInCell="1" allowOverlap="1" wp14:anchorId="084E4101" wp14:editId="2E9D4C93">
+            <wp:simplePos x="0" y="0"/>
+            <wp:positionH relativeFrom="column">
+              <wp:posOffset>206273</wp:posOffset>
+            </wp:positionH>
+            <wp:positionV relativeFrom="paragraph">
+              <wp:posOffset>249495</wp:posOffset>
+            </wp:positionV>
+            <wp:extent cx="5182870" cy="2236470"/>
+            <wp:effectExtent l="0" t="0" r="0" b="0"/>
+            <wp:wrapTopAndBottom/>
+            <wp:docPr id="533324294" name="Picture 1"/>
+            <wp:cNvGraphicFramePr>
+              <a:graphicFrameLocks xmlns:a="http://schemas.openxmlformats.org/drawingml/2006/main" noChangeAspect="1"/>
+            </wp:cNvGraphicFramePr>
+            <a:graphic xmlns:a="http://schemas.openxmlformats.org/drawingml/2006/main">
+              <a:graphicData uri="http://schemas.openxmlformats.org/drawingml/2006/picture">
+                <pic:pic xmlns:pic="http://schemas.openxmlformats.org/drawingml/2006/picture">
+                  <pic:nvPicPr>
+                    <pic:cNvPr id="533324294" name=""/>
+                    <pic:cNvPicPr/>
+                  </pic:nvPicPr>
+                  <pic:blipFill>
+                    <a:blip r:embed="rId10">
+                      <a:extLst>
+                        <a:ext uri="{28A0092B-C50C-407E-A947-70E740481C1C}">
+                          <a14:useLocalDpi xmlns:a14="http://schemas.microsoft.com/office/drawing/2010/main" val="0"/>
+                        </a:ext>
+                      </a:extLst>
+                    </a:blip>
+                    <a:stretch>
+                      <a:fillRect/>
+                    </a:stretch>
+                  </pic:blipFill>
+                  <pic:spPr>
+                    <a:xfrm>
+                      <a:off x="0" y="0"/>
+                      <a:ext cx="5182870" cy="2236470"/>
+                    </a:xfrm>
+                    <a:prstGeom prst="rect">
+                      <a:avLst/>
+                    </a:prstGeom>
+                  </pic:spPr>
+                </pic:pic>
+              </a:graphicData>
+            </a:graphic>
+          </wp:anchor>
+        </w:drawing>
+      </w:r>
+    </w:p>
+    <w:p/>
+    <w:p>
+      <w:r>
+        <w:drawing>
+          <wp:inline distT="0" distB="0" distL="0" distR="0" wp14:anchorId="417562AF" wp14:editId="4F579B0E">
+            <wp:extent cx="704948" cy="314369"/>
+            <wp:effectExtent l="0" t="0" r="0" b="9525"/>
+            <wp:docPr id="678657082" name="Picture 1"/>
+            <wp:cNvGraphicFramePr>
+              <a:graphicFrameLocks xmlns:a="http://schemas.openxmlformats.org/drawingml/2006/main" noChangeAspect="1"/>
+            </wp:cNvGraphicFramePr>
+            <a:graphic xmlns:a="http://schemas.openxmlformats.org/drawingml/2006/main">
+              <a:graphicData uri="http://schemas.openxmlformats.org/drawingml/2006/picture">
+                <pic:pic xmlns:pic="http://schemas.openxmlformats.org/drawingml/2006/picture">
+                  <pic:nvPicPr>
+                    <pic:cNvPr id="678657082" name=""/>
+                    <pic:cNvPicPr/>
+                  </pic:nvPicPr>
+                  <pic:blipFill>
+                    <a:blip r:embed="rId11"/>
+                    <a:stretch>
+                      <a:fillRect/>
+                    </a:stretch>
+                  </pic:blipFill>
+                  <pic:spPr>
+                    <a:xfrm>
+                      <a:off x="0" y="0"/>
+                      <a:ext cx="704948" cy="314369"/>
+                    </a:xfrm>
+                    <a:prstGeom prst="rect">
+                      <a:avLst/>
+                    </a:prstGeom>
+                  </pic:spPr>
+                </pic:pic>
+              </a:graphicData>
+            </a:graphic>
+          </wp:inline>
+        </w:drawing>
+      </w:r>
     </w:p>
     <w:p>
       <w:pPr>
@@ -3521,6 +5023,52 @@
       <w:bookmarkEnd w:id="17"/>
     </w:p>
     <w:p>
+      <w:r>
+        <w:t xml:space="preserve">Guesses are stored as pairs of a String and an array of </w:t>
+      </w:r>
+      <w:proofErr w:type="spellStart"/>
+      <w:r>
+        <w:t>GuessAccuracies</w:t>
+      </w:r>
+      <w:proofErr w:type="spellEnd"/>
+      <w:r>
+        <w:t xml:space="preserve">, which is an </w:t>
+      </w:r>
+      <w:proofErr w:type="spellStart"/>
+      <w:r>
+        <w:t>enum</w:t>
+      </w:r>
+      <w:proofErr w:type="spellEnd"/>
+      <w:r>
+        <w:t xml:space="preserve"> with “CORRECT, WRONG_POSITION, INCORRECT” as values. </w:t>
+      </w:r>
+      <w:r>
+        <w:t>Calculating how accurate the guess is, is done in two passes. In the first pass</w:t>
+      </w:r>
+      <w:r>
+        <w:t xml:space="preserve">, it just checks if any letters are already in the correct position and stores those letters. In the second pass it checks for any incorrectly positioned letters. If the letter appears in the word, it adds a WRONG_POSITION </w:t>
+      </w:r>
+      <w:proofErr w:type="spellStart"/>
+      <w:r>
+        <w:t>GuessAccuracy</w:t>
+      </w:r>
+      <w:proofErr w:type="spellEnd"/>
+      <w:r>
+        <w:t>, otherwise INCORRECT.</w:t>
+      </w:r>
+      <w:r>
+        <w:t xml:space="preserve"> The </w:t>
+      </w:r>
+      <w:proofErr w:type="spellStart"/>
+      <w:r>
+        <w:t>GuessAccuracies</w:t>
+      </w:r>
+      <w:proofErr w:type="spellEnd"/>
+      <w:r>
+        <w:t xml:space="preserve"> get displayed as different colors when the guesses are printed to the console.</w:t>
+      </w:r>
+    </w:p>
+    <w:p>
       <w:pPr>
         <w:pStyle w:val="Heading2"/>
       </w:pPr>
@@ -3532,13 +5080,1414 @@
     </w:p>
     <w:p>
       <w:pPr>
+        <w:pStyle w:val="Pseoudocode"/>
+      </w:pPr>
+      <w:r>
+        <w:t xml:space="preserve">private Guess </w:t>
+      </w:r>
+      <w:proofErr w:type="spellStart"/>
+      <w:r>
+        <w:t>computeGuess</w:t>
+      </w:r>
+      <w:proofErr w:type="spellEnd"/>
+      <w:r>
+        <w:t xml:space="preserve">(String </w:t>
+      </w:r>
+      <w:proofErr w:type="spellStart"/>
+      <w:r>
+        <w:t>guessedWord</w:t>
+      </w:r>
+      <w:proofErr w:type="spellEnd"/>
+      <w:r>
+        <w:t>)</w:t>
+      </w:r>
+      <w:r>
+        <w:br/>
+        <w:t>{</w:t>
+      </w:r>
+      <w:r>
+        <w:br/>
+        <w:t xml:space="preserve">    </w:t>
+      </w:r>
+      <w:proofErr w:type="spellStart"/>
+      <w:r>
+        <w:t>GuessAccuracy</w:t>
+      </w:r>
+      <w:proofErr w:type="spellEnd"/>
+      <w:r>
+        <w:t xml:space="preserve">[] accuracies = new </w:t>
+      </w:r>
+      <w:proofErr w:type="spellStart"/>
+      <w:r>
+        <w:t>GuessAccuracy</w:t>
+      </w:r>
+      <w:proofErr w:type="spellEnd"/>
+      <w:r>
+        <w:t>[</w:t>
+      </w:r>
+      <w:proofErr w:type="spellStart"/>
+      <w:r>
+        <w:t>Config.</w:t>
+      </w:r>
+      <w:r>
+        <w:rPr>
+          <w:i/>
+          <w:iCs/>
+        </w:rPr>
+        <w:t>MAX_WORD_LENGTH</w:t>
+      </w:r>
+      <w:proofErr w:type="spellEnd"/>
+      <w:r>
+        <w:t>];</w:t>
+      </w:r>
+      <w:r>
+        <w:br/>
+        <w:t xml:space="preserve">    </w:t>
+      </w:r>
+      <w:proofErr w:type="spellStart"/>
+      <w:r>
+        <w:t>boolean</w:t>
+      </w:r>
+      <w:proofErr w:type="spellEnd"/>
+      <w:r>
+        <w:t xml:space="preserve">[] </w:t>
+      </w:r>
+      <w:proofErr w:type="spellStart"/>
+      <w:r>
+        <w:t>letterUsedInPickedWord</w:t>
+      </w:r>
+      <w:proofErr w:type="spellEnd"/>
+      <w:r>
+        <w:t xml:space="preserve"> = new </w:t>
+      </w:r>
+      <w:proofErr w:type="spellStart"/>
+      <w:r>
+        <w:t>boolean</w:t>
+      </w:r>
+      <w:proofErr w:type="spellEnd"/>
+      <w:r>
+        <w:t>[</w:t>
+      </w:r>
+      <w:proofErr w:type="spellStart"/>
+      <w:r>
+        <w:t>Config.</w:t>
+      </w:r>
+      <w:r>
+        <w:rPr>
+          <w:i/>
+          <w:iCs/>
+        </w:rPr>
+        <w:t>MAX_WORD_LENGTH</w:t>
+      </w:r>
+      <w:proofErr w:type="spellEnd"/>
+      <w:r>
+        <w:t>];</w:t>
+      </w:r>
+      <w:r>
+        <w:br/>
+      </w:r>
+      <w:r>
+        <w:br/>
+        <w:t xml:space="preserve">    </w:t>
+      </w:r>
+      <w:r>
+        <w:rPr>
+          <w:i/>
+          <w:iCs/>
+        </w:rPr>
+        <w:t>// First pass: Check for correct letters in correct positions</w:t>
+      </w:r>
+      <w:r>
+        <w:rPr>
+          <w:i/>
+          <w:iCs/>
+        </w:rPr>
+        <w:br/>
+        <w:t xml:space="preserve">    </w:t>
+      </w:r>
+      <w:r>
+        <w:t xml:space="preserve">for (int </w:t>
+      </w:r>
+      <w:proofErr w:type="spellStart"/>
+      <w:r>
+        <w:t>i</w:t>
+      </w:r>
+      <w:proofErr w:type="spellEnd"/>
+      <w:r>
+        <w:t xml:space="preserve"> = 0; </w:t>
+      </w:r>
+      <w:proofErr w:type="spellStart"/>
+      <w:r>
+        <w:t>i</w:t>
+      </w:r>
+      <w:proofErr w:type="spellEnd"/>
+      <w:r>
+        <w:t xml:space="preserve"> &lt; </w:t>
+      </w:r>
+      <w:proofErr w:type="spellStart"/>
+      <w:r>
+        <w:t>Config.</w:t>
+      </w:r>
+      <w:r>
+        <w:rPr>
+          <w:i/>
+          <w:iCs/>
+        </w:rPr>
+        <w:t>MAX_WORD_LENGTH</w:t>
+      </w:r>
+      <w:proofErr w:type="spellEnd"/>
+      <w:r>
+        <w:t xml:space="preserve">; </w:t>
+      </w:r>
+      <w:proofErr w:type="spellStart"/>
+      <w:r>
+        <w:t>i</w:t>
+      </w:r>
+      <w:proofErr w:type="spellEnd"/>
+      <w:r>
+        <w:t>++)</w:t>
+      </w:r>
+      <w:r>
+        <w:br/>
+        <w:t xml:space="preserve">    {</w:t>
+      </w:r>
+      <w:r>
+        <w:br/>
+        <w:t xml:space="preserve">        if (</w:t>
+      </w:r>
+      <w:proofErr w:type="spellStart"/>
+      <w:r>
+        <w:t>guessedWord.charAt</w:t>
+      </w:r>
+      <w:proofErr w:type="spellEnd"/>
+      <w:r>
+        <w:t>(</w:t>
+      </w:r>
+      <w:proofErr w:type="spellStart"/>
+      <w:r>
+        <w:t>i</w:t>
+      </w:r>
+      <w:proofErr w:type="spellEnd"/>
+      <w:r>
+        <w:t xml:space="preserve">) == </w:t>
+      </w:r>
+      <w:proofErr w:type="spellStart"/>
+      <w:r>
+        <w:t>pickedWord.charAt</w:t>
+      </w:r>
+      <w:proofErr w:type="spellEnd"/>
+      <w:r>
+        <w:t>(</w:t>
+      </w:r>
+      <w:proofErr w:type="spellStart"/>
+      <w:r>
+        <w:t>i</w:t>
+      </w:r>
+      <w:proofErr w:type="spellEnd"/>
+      <w:r>
+        <w:t>))</w:t>
+      </w:r>
+      <w:r>
+        <w:br/>
+        <w:t xml:space="preserve">        {</w:t>
+      </w:r>
+      <w:r>
+        <w:br/>
+        <w:t xml:space="preserve">            accuracies[</w:t>
+      </w:r>
+      <w:proofErr w:type="spellStart"/>
+      <w:r>
+        <w:t>i</w:t>
+      </w:r>
+      <w:proofErr w:type="spellEnd"/>
+      <w:r>
+        <w:t xml:space="preserve">] = </w:t>
+      </w:r>
+      <w:proofErr w:type="spellStart"/>
+      <w:r>
+        <w:t>GuessAccuracy.</w:t>
+      </w:r>
+      <w:r>
+        <w:rPr>
+          <w:i/>
+          <w:iCs/>
+        </w:rPr>
+        <w:t>CORRECT</w:t>
+      </w:r>
+      <w:proofErr w:type="spellEnd"/>
+      <w:r>
+        <w:t>;</w:t>
+      </w:r>
+      <w:r>
+        <w:br/>
+        <w:t xml:space="preserve">            </w:t>
+      </w:r>
+      <w:proofErr w:type="spellStart"/>
+      <w:r>
+        <w:t>letterUsedInPickedWord</w:t>
+      </w:r>
+      <w:proofErr w:type="spellEnd"/>
+      <w:r>
+        <w:t>[</w:t>
+      </w:r>
+      <w:proofErr w:type="spellStart"/>
+      <w:r>
+        <w:t>i</w:t>
+      </w:r>
+      <w:proofErr w:type="spellEnd"/>
+      <w:r>
+        <w:t>] = true;</w:t>
+      </w:r>
+      <w:r>
+        <w:br/>
+        <w:t xml:space="preserve">        }</w:t>
+      </w:r>
+      <w:r>
+        <w:br/>
+        <w:t xml:space="preserve">    }</w:t>
+      </w:r>
+      <w:r>
+        <w:br/>
+      </w:r>
+      <w:r>
+        <w:br/>
+        <w:t xml:space="preserve">    </w:t>
+      </w:r>
+      <w:r>
+        <w:rPr>
+          <w:i/>
+          <w:iCs/>
+        </w:rPr>
+        <w:t>// Second pass: Check for correct letters in wrong positions</w:t>
+      </w:r>
+      <w:r>
+        <w:rPr>
+          <w:i/>
+          <w:iCs/>
+        </w:rPr>
+        <w:br/>
+        <w:t xml:space="preserve">    </w:t>
+      </w:r>
+      <w:r>
+        <w:t xml:space="preserve">for (int </w:t>
+      </w:r>
+      <w:proofErr w:type="spellStart"/>
+      <w:r>
+        <w:t>i</w:t>
+      </w:r>
+      <w:proofErr w:type="spellEnd"/>
+      <w:r>
+        <w:t xml:space="preserve"> = 0; </w:t>
+      </w:r>
+      <w:proofErr w:type="spellStart"/>
+      <w:r>
+        <w:t>i</w:t>
+      </w:r>
+      <w:proofErr w:type="spellEnd"/>
+      <w:r>
+        <w:t xml:space="preserve"> &lt; </w:t>
+      </w:r>
+      <w:proofErr w:type="spellStart"/>
+      <w:r>
+        <w:t>Config.</w:t>
+      </w:r>
+      <w:r>
+        <w:rPr>
+          <w:i/>
+          <w:iCs/>
+        </w:rPr>
+        <w:t>MAX_WORD_LENGTH</w:t>
+      </w:r>
+      <w:proofErr w:type="spellEnd"/>
+      <w:r>
+        <w:t xml:space="preserve">; </w:t>
+      </w:r>
+      <w:proofErr w:type="spellStart"/>
+      <w:r>
+        <w:t>i</w:t>
+      </w:r>
+      <w:proofErr w:type="spellEnd"/>
+      <w:r>
+        <w:t>++)</w:t>
+      </w:r>
+      <w:r>
+        <w:br/>
+        <w:t xml:space="preserve">    {</w:t>
+      </w:r>
+      <w:r>
+        <w:br/>
+        <w:t xml:space="preserve">        if (accuracies[</w:t>
+      </w:r>
+      <w:proofErr w:type="spellStart"/>
+      <w:r>
+        <w:t>i</w:t>
+      </w:r>
+      <w:proofErr w:type="spellEnd"/>
+      <w:r>
+        <w:t>] == null)</w:t>
+      </w:r>
+      <w:r>
+        <w:br/>
+        <w:t xml:space="preserve">        {</w:t>
+      </w:r>
+      <w:r>
+        <w:br/>
+        <w:t xml:space="preserve">            </w:t>
+      </w:r>
+      <w:proofErr w:type="spellStart"/>
+      <w:r>
+        <w:t>boolean</w:t>
+      </w:r>
+      <w:proofErr w:type="spellEnd"/>
+      <w:r>
+        <w:t xml:space="preserve"> found = false;</w:t>
+      </w:r>
+      <w:r>
+        <w:br/>
+        <w:t xml:space="preserve">            for (int j = 0; j &lt; </w:t>
+      </w:r>
+      <w:proofErr w:type="spellStart"/>
+      <w:r>
+        <w:t>Config.</w:t>
+      </w:r>
+      <w:r>
+        <w:rPr>
+          <w:i/>
+          <w:iCs/>
+        </w:rPr>
+        <w:t>MAX_WORD_LENGTH</w:t>
+      </w:r>
+      <w:proofErr w:type="spellEnd"/>
+      <w:r>
+        <w:t xml:space="preserve">; </w:t>
+      </w:r>
+      <w:proofErr w:type="spellStart"/>
+      <w:r>
+        <w:t>j++</w:t>
+      </w:r>
+      <w:proofErr w:type="spellEnd"/>
+      <w:r>
+        <w:t>)</w:t>
+      </w:r>
+      <w:r>
+        <w:br/>
+        <w:t xml:space="preserve">            {</w:t>
+      </w:r>
+      <w:r>
+        <w:br/>
+      </w:r>
+      <w:r>
+        <w:lastRenderedPageBreak/>
+        <w:t xml:space="preserve">                if (!</w:t>
+      </w:r>
+      <w:proofErr w:type="spellStart"/>
+      <w:r>
+        <w:t>letterUsedInPickedWord</w:t>
+      </w:r>
+      <w:proofErr w:type="spellEnd"/>
+      <w:r>
+        <w:t xml:space="preserve">[j] &amp;&amp; </w:t>
+      </w:r>
+      <w:proofErr w:type="spellStart"/>
+      <w:r>
+        <w:t>guessedWord.charAt</w:t>
+      </w:r>
+      <w:proofErr w:type="spellEnd"/>
+      <w:r>
+        <w:t>(</w:t>
+      </w:r>
+      <w:proofErr w:type="spellStart"/>
+      <w:r>
+        <w:t>i</w:t>
+      </w:r>
+      <w:proofErr w:type="spellEnd"/>
+      <w:r>
+        <w:t xml:space="preserve">) == </w:t>
+      </w:r>
+      <w:proofErr w:type="spellStart"/>
+      <w:r>
+        <w:t>pickedWord.charAt</w:t>
+      </w:r>
+      <w:proofErr w:type="spellEnd"/>
+      <w:r>
+        <w:t>(j))</w:t>
+      </w:r>
+      <w:r>
+        <w:br/>
+        <w:t xml:space="preserve">                {</w:t>
+      </w:r>
+      <w:r>
+        <w:br/>
+        <w:t xml:space="preserve">                    found = true;</w:t>
+      </w:r>
+      <w:r>
+        <w:br/>
+        <w:t xml:space="preserve">                    </w:t>
+      </w:r>
+      <w:proofErr w:type="spellStart"/>
+      <w:r>
+        <w:t>letterUsedInPickedWord</w:t>
+      </w:r>
+      <w:proofErr w:type="spellEnd"/>
+      <w:r>
+        <w:t>[j] = true;</w:t>
+      </w:r>
+      <w:r>
+        <w:br/>
+        <w:t xml:space="preserve">                    break;</w:t>
+      </w:r>
+      <w:r>
+        <w:br/>
+        <w:t xml:space="preserve">                }</w:t>
+      </w:r>
+      <w:r>
+        <w:br/>
+        <w:t xml:space="preserve">            }</w:t>
+      </w:r>
+      <w:r>
+        <w:br/>
+        <w:t xml:space="preserve">            accuracies[</w:t>
+      </w:r>
+      <w:proofErr w:type="spellStart"/>
+      <w:r>
+        <w:t>i</w:t>
+      </w:r>
+      <w:proofErr w:type="spellEnd"/>
+      <w:r>
+        <w:t xml:space="preserve">] = found ? </w:t>
+      </w:r>
+      <w:proofErr w:type="spellStart"/>
+      <w:r>
+        <w:t>GuessAccuracy.</w:t>
+      </w:r>
+      <w:r>
+        <w:rPr>
+          <w:i/>
+          <w:iCs/>
+        </w:rPr>
+        <w:t>WRONG_POSITION</w:t>
+      </w:r>
+      <w:proofErr w:type="spellEnd"/>
+      <w:r>
+        <w:rPr>
+          <w:i/>
+          <w:iCs/>
+        </w:rPr>
+        <w:t xml:space="preserve"> </w:t>
+      </w:r>
+      <w:r>
+        <w:t xml:space="preserve">: </w:t>
+      </w:r>
+      <w:proofErr w:type="spellStart"/>
+      <w:r>
+        <w:t>GuessAccuracy.</w:t>
+      </w:r>
+      <w:r>
+        <w:rPr>
+          <w:i/>
+          <w:iCs/>
+        </w:rPr>
+        <w:t>INCORRECT</w:t>
+      </w:r>
+      <w:proofErr w:type="spellEnd"/>
+      <w:r>
+        <w:t>;</w:t>
+      </w:r>
+      <w:r>
+        <w:br/>
+        <w:t xml:space="preserve">        }</w:t>
+      </w:r>
+      <w:r>
+        <w:br/>
+        <w:t xml:space="preserve">    }</w:t>
+      </w:r>
+      <w:r>
+        <w:br/>
+      </w:r>
+      <w:r>
+        <w:br/>
+        <w:t xml:space="preserve">    return new Guess(</w:t>
+      </w:r>
+      <w:proofErr w:type="spellStart"/>
+      <w:r>
+        <w:t>guessedWord</w:t>
+      </w:r>
+      <w:proofErr w:type="spellEnd"/>
+      <w:r>
+        <w:t>, accuracies);</w:t>
+      </w:r>
+      <w:r>
+        <w:br/>
+        <w:t>}</w:t>
+      </w:r>
+    </w:p>
+    <w:p>
+      <w:pPr>
+        <w:pStyle w:val="Caption"/>
+        <w:rPr>
+          <w:lang w:val="en-AT"/>
+        </w:rPr>
+      </w:pPr>
+      <w:r>
+        <w:t xml:space="preserve">Figure </w:t>
+      </w:r>
+      <w:r>
+        <w:fldChar w:fldCharType="begin"/>
+      </w:r>
+      <w:r>
+        <w:instrText xml:space="preserve"> SEQ Figure \* ARABIC </w:instrText>
+      </w:r>
+      <w:r>
+        <w:fldChar w:fldCharType="separate"/>
+      </w:r>
+      <w:r>
+        <w:rPr>
+          <w:noProof/>
+        </w:rPr>
+        <w:t>10</w:t>
+      </w:r>
+      <w:r>
+        <w:fldChar w:fldCharType="end"/>
+      </w:r>
+      <w:r>
+        <w:t xml:space="preserve">: </w:t>
+      </w:r>
+      <w:proofErr w:type="spellStart"/>
+      <w:r>
+        <w:t>computeGuess</w:t>
+      </w:r>
+      <w:proofErr w:type="spellEnd"/>
+    </w:p>
+    <w:p>
+      <w:pPr>
+        <w:rPr>
+          <w:lang w:val="en-AT"/>
+        </w:rPr>
+      </w:pPr>
+    </w:p>
+    <w:p>
+      <w:pPr>
+        <w:pStyle w:val="Pseoudocode"/>
+        <w:rPr>
+          <w:lang w:val="en-US"/>
+        </w:rPr>
+      </w:pPr>
+      <w:r>
+        <w:rPr>
+          <w:lang w:val="en-US"/>
+        </w:rPr>
+        <w:t>pu</w:t>
+      </w:r>
+      <w:r>
+        <w:rPr>
+          <w:lang w:val="en-US"/>
+        </w:rPr>
+        <w:t>blic class Guess</w:t>
+      </w:r>
+      <w:r>
+        <w:rPr>
+          <w:lang w:val="en-US"/>
+        </w:rPr>
+        <w:br/>
+        <w:t>{</w:t>
+      </w:r>
+      <w:r>
+        <w:rPr>
+          <w:lang w:val="en-US"/>
+        </w:rPr>
+        <w:br/>
+        <w:t xml:space="preserve">    private final String word;</w:t>
+      </w:r>
+      <w:r>
+        <w:rPr>
+          <w:lang w:val="en-US"/>
+        </w:rPr>
+        <w:br/>
+        <w:t xml:space="preserve">    private final </w:t>
+      </w:r>
+      <w:proofErr w:type="spellStart"/>
+      <w:r>
+        <w:rPr>
+          <w:lang w:val="en-US"/>
+        </w:rPr>
+        <w:t>GuessAccuracy</w:t>
+      </w:r>
+      <w:proofErr w:type="spellEnd"/>
+      <w:r>
+        <w:rPr>
+          <w:lang w:val="en-US"/>
+        </w:rPr>
+        <w:t>[] accuracies;</w:t>
+      </w:r>
+      <w:r>
+        <w:rPr>
+          <w:lang w:val="en-US"/>
+        </w:rPr>
+        <w:br/>
+      </w:r>
+      <w:r>
+        <w:rPr>
+          <w:lang w:val="en-US"/>
+        </w:rPr>
+        <w:br/>
+        <w:t xml:space="preserve">    public Guess(String word, </w:t>
+      </w:r>
+      <w:proofErr w:type="spellStart"/>
+      <w:r>
+        <w:rPr>
+          <w:lang w:val="en-US"/>
+        </w:rPr>
+        <w:t>GuessAccuracy</w:t>
+      </w:r>
+      <w:proofErr w:type="spellEnd"/>
+      <w:r>
+        <w:rPr>
+          <w:lang w:val="en-US"/>
+        </w:rPr>
+        <w:t>[] accuracies)</w:t>
+      </w:r>
+      <w:r>
+        <w:rPr>
+          <w:lang w:val="en-US"/>
+        </w:rPr>
+        <w:br/>
+        <w:t xml:space="preserve">    {</w:t>
+      </w:r>
+      <w:r>
+        <w:rPr>
+          <w:lang w:val="en-US"/>
+        </w:rPr>
+        <w:br/>
+        <w:t xml:space="preserve">        </w:t>
+      </w:r>
+      <w:proofErr w:type="spellStart"/>
+      <w:r>
+        <w:rPr>
+          <w:lang w:val="en-US"/>
+        </w:rPr>
+        <w:t>this.word</w:t>
+      </w:r>
+      <w:proofErr w:type="spellEnd"/>
+      <w:r>
+        <w:rPr>
+          <w:lang w:val="en-US"/>
+        </w:rPr>
+        <w:t xml:space="preserve"> = word;</w:t>
+      </w:r>
+      <w:r>
+        <w:rPr>
+          <w:lang w:val="en-US"/>
+        </w:rPr>
+        <w:br/>
+        <w:t xml:space="preserve">        </w:t>
+      </w:r>
+      <w:proofErr w:type="spellStart"/>
+      <w:r>
+        <w:rPr>
+          <w:lang w:val="en-US"/>
+        </w:rPr>
+        <w:t>this.accuracies</w:t>
+      </w:r>
+      <w:proofErr w:type="spellEnd"/>
+      <w:r>
+        <w:rPr>
+          <w:lang w:val="en-US"/>
+        </w:rPr>
+        <w:t xml:space="preserve"> = accuracies;</w:t>
+      </w:r>
+      <w:r>
+        <w:rPr>
+          <w:lang w:val="en-US"/>
+        </w:rPr>
+        <w:br/>
+        <w:t xml:space="preserve">    }</w:t>
+      </w:r>
+      <w:r>
+        <w:rPr>
+          <w:lang w:val="en-US"/>
+        </w:rPr>
+        <w:br/>
+      </w:r>
+      <w:r>
+        <w:rPr>
+          <w:lang w:val="en-US"/>
+        </w:rPr>
+        <w:br/>
+        <w:t xml:space="preserve">    public void </w:t>
+      </w:r>
+      <w:proofErr w:type="spellStart"/>
+      <w:r>
+        <w:rPr>
+          <w:lang w:val="en-US"/>
+        </w:rPr>
+        <w:t>printGuess</w:t>
+      </w:r>
+      <w:proofErr w:type="spellEnd"/>
+      <w:r>
+        <w:rPr>
+          <w:lang w:val="en-US"/>
+        </w:rPr>
+        <w:t>()</w:t>
+      </w:r>
+      <w:r>
+        <w:rPr>
+          <w:lang w:val="en-US"/>
+        </w:rPr>
+        <w:br/>
+        <w:t xml:space="preserve">    {</w:t>
+      </w:r>
+      <w:r>
+        <w:rPr>
+          <w:lang w:val="en-US"/>
+        </w:rPr>
+        <w:br/>
+        <w:t xml:space="preserve">        for (int </w:t>
+      </w:r>
+      <w:proofErr w:type="spellStart"/>
+      <w:r>
+        <w:rPr>
+          <w:lang w:val="en-US"/>
+        </w:rPr>
+        <w:t>i</w:t>
+      </w:r>
+      <w:proofErr w:type="spellEnd"/>
+      <w:r>
+        <w:rPr>
+          <w:lang w:val="en-US"/>
+        </w:rPr>
+        <w:t xml:space="preserve"> = 0; </w:t>
+      </w:r>
+      <w:proofErr w:type="spellStart"/>
+      <w:r>
+        <w:rPr>
+          <w:lang w:val="en-US"/>
+        </w:rPr>
+        <w:t>i</w:t>
+      </w:r>
+      <w:proofErr w:type="spellEnd"/>
+      <w:r>
+        <w:rPr>
+          <w:lang w:val="en-US"/>
+        </w:rPr>
+        <w:t xml:space="preserve"> &lt; </w:t>
+      </w:r>
+      <w:proofErr w:type="spellStart"/>
+      <w:r>
+        <w:rPr>
+          <w:lang w:val="en-US"/>
+        </w:rPr>
+        <w:t>word.length</w:t>
+      </w:r>
+      <w:proofErr w:type="spellEnd"/>
+      <w:r>
+        <w:rPr>
+          <w:lang w:val="en-US"/>
+        </w:rPr>
+        <w:t xml:space="preserve">(); </w:t>
+      </w:r>
+      <w:proofErr w:type="spellStart"/>
+      <w:r>
+        <w:rPr>
+          <w:lang w:val="en-US"/>
+        </w:rPr>
+        <w:t>i</w:t>
+      </w:r>
+      <w:proofErr w:type="spellEnd"/>
+      <w:r>
+        <w:rPr>
+          <w:lang w:val="en-US"/>
+        </w:rPr>
+        <w:t>++)</w:t>
+      </w:r>
+      <w:r>
+        <w:rPr>
+          <w:lang w:val="en-US"/>
+        </w:rPr>
+        <w:br/>
+        <w:t xml:space="preserve">        {</w:t>
+      </w:r>
+      <w:r>
+        <w:rPr>
+          <w:lang w:val="en-US"/>
+        </w:rPr>
+        <w:br/>
+        <w:t xml:space="preserve">            char letter = </w:t>
+      </w:r>
+      <w:proofErr w:type="spellStart"/>
+      <w:r>
+        <w:rPr>
+          <w:lang w:val="en-US"/>
+        </w:rPr>
+        <w:t>word.charAt</w:t>
+      </w:r>
+      <w:proofErr w:type="spellEnd"/>
+      <w:r>
+        <w:rPr>
+          <w:lang w:val="en-US"/>
+        </w:rPr>
+        <w:t>(</w:t>
+      </w:r>
+      <w:proofErr w:type="spellStart"/>
+      <w:r>
+        <w:rPr>
+          <w:lang w:val="en-US"/>
+        </w:rPr>
+        <w:t>i</w:t>
+      </w:r>
+      <w:proofErr w:type="spellEnd"/>
+      <w:r>
+        <w:rPr>
+          <w:lang w:val="en-US"/>
+        </w:rPr>
+        <w:t>);</w:t>
+      </w:r>
+      <w:r>
+        <w:rPr>
+          <w:lang w:val="en-US"/>
+        </w:rPr>
+        <w:br/>
+        <w:t xml:space="preserve">            </w:t>
+      </w:r>
+      <w:proofErr w:type="spellStart"/>
+      <w:r>
+        <w:rPr>
+          <w:lang w:val="en-US"/>
+        </w:rPr>
+        <w:t>GuessAccuracy</w:t>
+      </w:r>
+      <w:proofErr w:type="spellEnd"/>
+      <w:r>
+        <w:rPr>
+          <w:lang w:val="en-US"/>
+        </w:rPr>
+        <w:t xml:space="preserve"> accuracy = accuracies[</w:t>
+      </w:r>
+      <w:proofErr w:type="spellStart"/>
+      <w:r>
+        <w:rPr>
+          <w:lang w:val="en-US"/>
+        </w:rPr>
+        <w:t>i</w:t>
+      </w:r>
+      <w:proofErr w:type="spellEnd"/>
+      <w:r>
+        <w:rPr>
+          <w:lang w:val="en-US"/>
+        </w:rPr>
+        <w:t>];</w:t>
+      </w:r>
+      <w:r>
+        <w:rPr>
+          <w:lang w:val="en-US"/>
+        </w:rPr>
+        <w:br/>
+      </w:r>
+      <w:r>
+        <w:rPr>
+          <w:lang w:val="en-US"/>
+        </w:rPr>
+        <w:br/>
+        <w:t xml:space="preserve">            switch (accuracy)</w:t>
+      </w:r>
+      <w:r>
+        <w:rPr>
+          <w:lang w:val="en-US"/>
+        </w:rPr>
+        <w:br/>
+        <w:t xml:space="preserve">            {</w:t>
+      </w:r>
+      <w:r>
+        <w:rPr>
+          <w:lang w:val="en-US"/>
+        </w:rPr>
+        <w:br/>
+        <w:t xml:space="preserve">                case </w:t>
+      </w:r>
+      <w:r>
+        <w:rPr>
+          <w:i/>
+          <w:iCs/>
+          <w:lang w:val="en-US"/>
+        </w:rPr>
+        <w:t xml:space="preserve">CORRECT </w:t>
+      </w:r>
+      <w:r>
+        <w:rPr>
+          <w:lang w:val="en-US"/>
+        </w:rPr>
+        <w:t xml:space="preserve">-&gt; </w:t>
+      </w:r>
+      <w:proofErr w:type="spellStart"/>
+      <w:r>
+        <w:rPr>
+          <w:lang w:val="en-US"/>
+        </w:rPr>
+        <w:t>UI.</w:t>
+      </w:r>
+      <w:r>
+        <w:rPr>
+          <w:i/>
+          <w:iCs/>
+          <w:lang w:val="en-US"/>
+        </w:rPr>
+        <w:t>printGreen</w:t>
+      </w:r>
+      <w:proofErr w:type="spellEnd"/>
+      <w:r>
+        <w:rPr>
+          <w:lang w:val="en-US"/>
+        </w:rPr>
+        <w:t>(</w:t>
+      </w:r>
+      <w:proofErr w:type="spellStart"/>
+      <w:r>
+        <w:rPr>
+          <w:lang w:val="en-US"/>
+        </w:rPr>
+        <w:t>String.</w:t>
+      </w:r>
+      <w:r>
+        <w:rPr>
+          <w:i/>
+          <w:iCs/>
+          <w:lang w:val="en-US"/>
+        </w:rPr>
+        <w:t>valueOf</w:t>
+      </w:r>
+      <w:proofErr w:type="spellEnd"/>
+      <w:r>
+        <w:rPr>
+          <w:lang w:val="en-US"/>
+        </w:rPr>
+        <w:t>(letter));</w:t>
+      </w:r>
+      <w:r>
+        <w:rPr>
+          <w:lang w:val="en-US"/>
+        </w:rPr>
+        <w:br/>
+        <w:t xml:space="preserve">                case </w:t>
+      </w:r>
+      <w:r>
+        <w:rPr>
+          <w:i/>
+          <w:iCs/>
+          <w:lang w:val="en-US"/>
+        </w:rPr>
+        <w:t xml:space="preserve">WRONG_POSITION </w:t>
+      </w:r>
+      <w:r>
+        <w:rPr>
+          <w:lang w:val="en-US"/>
+        </w:rPr>
+        <w:t xml:space="preserve">-&gt; </w:t>
+      </w:r>
+      <w:proofErr w:type="spellStart"/>
+      <w:r>
+        <w:rPr>
+          <w:lang w:val="en-US"/>
+        </w:rPr>
+        <w:lastRenderedPageBreak/>
+        <w:t>UI.</w:t>
+      </w:r>
+      <w:r>
+        <w:rPr>
+          <w:i/>
+          <w:iCs/>
+          <w:lang w:val="en-US"/>
+        </w:rPr>
+        <w:t>printYellow</w:t>
+      </w:r>
+      <w:proofErr w:type="spellEnd"/>
+      <w:r>
+        <w:rPr>
+          <w:lang w:val="en-US"/>
+        </w:rPr>
+        <w:t>(</w:t>
+      </w:r>
+      <w:proofErr w:type="spellStart"/>
+      <w:r>
+        <w:rPr>
+          <w:lang w:val="en-US"/>
+        </w:rPr>
+        <w:t>String.</w:t>
+      </w:r>
+      <w:r>
+        <w:rPr>
+          <w:i/>
+          <w:iCs/>
+          <w:lang w:val="en-US"/>
+        </w:rPr>
+        <w:t>valueOf</w:t>
+      </w:r>
+      <w:proofErr w:type="spellEnd"/>
+      <w:r>
+        <w:rPr>
+          <w:lang w:val="en-US"/>
+        </w:rPr>
+        <w:t>(letter));</w:t>
+      </w:r>
+      <w:r>
+        <w:rPr>
+          <w:lang w:val="en-US"/>
+        </w:rPr>
+        <w:br/>
+        <w:t xml:space="preserve">                case </w:t>
+      </w:r>
+      <w:r>
+        <w:rPr>
+          <w:i/>
+          <w:iCs/>
+          <w:lang w:val="en-US"/>
+        </w:rPr>
+        <w:t xml:space="preserve">INCORRECT </w:t>
+      </w:r>
+      <w:r>
+        <w:rPr>
+          <w:lang w:val="en-US"/>
+        </w:rPr>
+        <w:t xml:space="preserve">-&gt; </w:t>
+      </w:r>
+      <w:proofErr w:type="spellStart"/>
+      <w:r>
+        <w:rPr>
+          <w:lang w:val="en-US"/>
+        </w:rPr>
+        <w:t>UI.</w:t>
+      </w:r>
+      <w:r>
+        <w:rPr>
+          <w:i/>
+          <w:iCs/>
+          <w:lang w:val="en-US"/>
+        </w:rPr>
+        <w:t>printGray</w:t>
+      </w:r>
+      <w:proofErr w:type="spellEnd"/>
+      <w:r>
+        <w:rPr>
+          <w:lang w:val="en-US"/>
+        </w:rPr>
+        <w:t>(</w:t>
+      </w:r>
+      <w:proofErr w:type="spellStart"/>
+      <w:r>
+        <w:rPr>
+          <w:lang w:val="en-US"/>
+        </w:rPr>
+        <w:t>String.</w:t>
+      </w:r>
+      <w:r>
+        <w:rPr>
+          <w:i/>
+          <w:iCs/>
+          <w:lang w:val="en-US"/>
+        </w:rPr>
+        <w:t>valueOf</w:t>
+      </w:r>
+      <w:proofErr w:type="spellEnd"/>
+      <w:r>
+        <w:rPr>
+          <w:lang w:val="en-US"/>
+        </w:rPr>
+        <w:t>(letter));</w:t>
+      </w:r>
+      <w:r>
+        <w:rPr>
+          <w:lang w:val="en-US"/>
+        </w:rPr>
+        <w:br/>
+        <w:t xml:space="preserve">            }</w:t>
+      </w:r>
+      <w:r>
+        <w:rPr>
+          <w:lang w:val="en-US"/>
+        </w:rPr>
+        <w:br/>
+        <w:t xml:space="preserve">        }</w:t>
+      </w:r>
+      <w:r>
+        <w:rPr>
+          <w:lang w:val="en-US"/>
+        </w:rPr>
+        <w:br/>
+        <w:t xml:space="preserve">        </w:t>
+      </w:r>
+      <w:proofErr w:type="spellStart"/>
+      <w:r>
+        <w:rPr>
+          <w:lang w:val="en-US"/>
+        </w:rPr>
+        <w:t>UI.</w:t>
+      </w:r>
+      <w:r>
+        <w:rPr>
+          <w:i/>
+          <w:iCs/>
+          <w:lang w:val="en-US"/>
+        </w:rPr>
+        <w:t>printBlankSeparatorLine</w:t>
+      </w:r>
+      <w:proofErr w:type="spellEnd"/>
+      <w:r>
+        <w:rPr>
+          <w:lang w:val="en-US"/>
+        </w:rPr>
+        <w:t>();</w:t>
+      </w:r>
+      <w:r>
+        <w:rPr>
+          <w:lang w:val="en-US"/>
+        </w:rPr>
+        <w:br/>
+        <w:t xml:space="preserve">    }</w:t>
+      </w:r>
+      <w:r>
+        <w:rPr>
+          <w:lang w:val="en-US"/>
+        </w:rPr>
+        <w:br/>
+      </w:r>
+      <w:r>
+        <w:rPr>
+          <w:lang w:val="en-US"/>
+        </w:rPr>
+        <w:br/>
+        <w:t xml:space="preserve">    public String </w:t>
+      </w:r>
+      <w:proofErr w:type="spellStart"/>
+      <w:r>
+        <w:rPr>
+          <w:lang w:val="en-US"/>
+        </w:rPr>
+        <w:t>getWord</w:t>
+      </w:r>
+      <w:proofErr w:type="spellEnd"/>
+      <w:r>
+        <w:rPr>
+          <w:lang w:val="en-US"/>
+        </w:rPr>
+        <w:t>()</w:t>
+      </w:r>
+      <w:r>
+        <w:rPr>
+          <w:lang w:val="en-US"/>
+        </w:rPr>
+        <w:br/>
+        <w:t xml:space="preserve">    {</w:t>
+      </w:r>
+      <w:r>
+        <w:rPr>
+          <w:lang w:val="en-US"/>
+        </w:rPr>
+        <w:br/>
+        <w:t xml:space="preserve">        return word;</w:t>
+      </w:r>
+      <w:r>
+        <w:rPr>
+          <w:lang w:val="en-US"/>
+        </w:rPr>
+        <w:br/>
+        <w:t xml:space="preserve">    }</w:t>
+      </w:r>
+      <w:r>
+        <w:rPr>
+          <w:lang w:val="en-US"/>
+        </w:rPr>
+        <w:br/>
+      </w:r>
+      <w:r>
+        <w:rPr>
+          <w:lang w:val="en-US"/>
+        </w:rPr>
+        <w:br/>
+        <w:t xml:space="preserve">    public </w:t>
+      </w:r>
+      <w:proofErr w:type="spellStart"/>
+      <w:r>
+        <w:rPr>
+          <w:lang w:val="en-US"/>
+        </w:rPr>
+        <w:t>GuessAccuracy</w:t>
+      </w:r>
+      <w:proofErr w:type="spellEnd"/>
+      <w:r>
+        <w:rPr>
+          <w:lang w:val="en-US"/>
+        </w:rPr>
+        <w:t xml:space="preserve">[] </w:t>
+      </w:r>
+      <w:proofErr w:type="spellStart"/>
+      <w:r>
+        <w:rPr>
+          <w:lang w:val="en-US"/>
+        </w:rPr>
+        <w:t>getAccuracies</w:t>
+      </w:r>
+      <w:proofErr w:type="spellEnd"/>
+      <w:r>
+        <w:rPr>
+          <w:lang w:val="en-US"/>
+        </w:rPr>
+        <w:t>()</w:t>
+      </w:r>
+      <w:r>
+        <w:rPr>
+          <w:lang w:val="en-US"/>
+        </w:rPr>
+        <w:br/>
+        <w:t xml:space="preserve">    {</w:t>
+      </w:r>
+      <w:r>
+        <w:rPr>
+          <w:lang w:val="en-US"/>
+        </w:rPr>
+        <w:br/>
+        <w:t xml:space="preserve">        return accuracies;</w:t>
+      </w:r>
+      <w:r>
+        <w:rPr>
+          <w:lang w:val="en-US"/>
+        </w:rPr>
+        <w:br/>
+        <w:t xml:space="preserve">    }</w:t>
+      </w:r>
+      <w:r>
+        <w:rPr>
+          <w:lang w:val="en-US"/>
+        </w:rPr>
+        <w:br/>
+        <w:t>}</w:t>
+      </w:r>
+    </w:p>
+    <w:p>
+      <w:pPr>
+        <w:pStyle w:val="Caption"/>
+        <w:rPr>
+          <w:lang w:val="en-AT"/>
+        </w:rPr>
+      </w:pPr>
+      <w:r>
+        <w:t xml:space="preserve">Figure </w:t>
+      </w:r>
+      <w:r>
+        <w:fldChar w:fldCharType="begin"/>
+      </w:r>
+      <w:r>
+        <w:instrText xml:space="preserve"> SEQ Figure \* ARABIC </w:instrText>
+      </w:r>
+      <w:r>
+        <w:fldChar w:fldCharType="separate"/>
+      </w:r>
+      <w:r>
+        <w:rPr>
+          <w:noProof/>
+        </w:rPr>
+        <w:t>11</w:t>
+      </w:r>
+      <w:r>
+        <w:fldChar w:fldCharType="end"/>
+      </w:r>
+      <w:r>
+        <w:t>: Guess</w:t>
+      </w:r>
+    </w:p>
+    <w:p>
+      <w:pPr>
+        <w:rPr>
+          <w:lang w:val="en-AT"/>
+        </w:rPr>
+      </w:pPr>
+    </w:p>
+    <w:p>
+      <w:pPr>
         <w:pStyle w:val="Heading2"/>
       </w:pPr>
       <w:bookmarkStart w:id="19" w:name="_Toc217572537"/>
       <w:r>
+        <w:drawing>
+          <wp:anchor distT="0" distB="0" distL="114300" distR="114300" simplePos="0" relativeHeight="251668480" behindDoc="0" locked="0" layoutInCell="1" allowOverlap="1" wp14:anchorId="67765B9D" wp14:editId="48A393B0">
+            <wp:simplePos x="0" y="0"/>
+            <wp:positionH relativeFrom="column">
+              <wp:posOffset>52760</wp:posOffset>
+            </wp:positionH>
+            <wp:positionV relativeFrom="paragraph">
+              <wp:posOffset>429992</wp:posOffset>
+            </wp:positionV>
+            <wp:extent cx="5182870" cy="2049145"/>
+            <wp:effectExtent l="0" t="0" r="0" b="8255"/>
+            <wp:wrapTopAndBottom/>
+            <wp:docPr id="491282084" name="Picture 1"/>
+            <wp:cNvGraphicFramePr>
+              <a:graphicFrameLocks xmlns:a="http://schemas.openxmlformats.org/drawingml/2006/main" noChangeAspect="1"/>
+            </wp:cNvGraphicFramePr>
+            <a:graphic xmlns:a="http://schemas.openxmlformats.org/drawingml/2006/main">
+              <a:graphicData uri="http://schemas.openxmlformats.org/drawingml/2006/picture">
+                <pic:pic xmlns:pic="http://schemas.openxmlformats.org/drawingml/2006/picture">
+                  <pic:nvPicPr>
+                    <pic:cNvPr id="491282084" name=""/>
+                    <pic:cNvPicPr/>
+                  </pic:nvPicPr>
+                  <pic:blipFill>
+                    <a:blip r:embed="rId12">
+                      <a:extLst>
+                        <a:ext uri="{28A0092B-C50C-407E-A947-70E740481C1C}">
+                          <a14:useLocalDpi xmlns:a14="http://schemas.microsoft.com/office/drawing/2010/main" val="0"/>
+                        </a:ext>
+                      </a:extLst>
+                    </a:blip>
+                    <a:stretch>
+                      <a:fillRect/>
+                    </a:stretch>
+                  </pic:blipFill>
+                  <pic:spPr>
+                    <a:xfrm>
+                      <a:off x="0" y="0"/>
+                      <a:ext cx="5182870" cy="2049145"/>
+                    </a:xfrm>
+                    <a:prstGeom prst="rect">
+                      <a:avLst/>
+                    </a:prstGeom>
+                  </pic:spPr>
+                </pic:pic>
+              </a:graphicData>
+            </a:graphic>
+          </wp:anchor>
+        </w:drawing>
+      </w:r>
+      <w:r>
         <w:t>Test</w:t>
       </w:r>
       <w:bookmarkEnd w:id="19"/>
+    </w:p>
+    <w:p>
+      <w:pPr>
+        <w:pStyle w:val="Caption"/>
+      </w:pPr>
+      <w:r>
+        <w:t xml:space="preserve">Figure </w:t>
+      </w:r>
+      <w:r>
+        <w:fldChar w:fldCharType="begin"/>
+      </w:r>
+      <w:r>
+        <w:instrText xml:space="preserve"> SEQ Figure \* ARABIC </w:instrText>
+      </w:r>
+      <w:r>
+        <w:fldChar w:fldCharType="separate"/>
+      </w:r>
+      <w:r>
+        <w:rPr>
+          <w:noProof/>
+        </w:rPr>
+        <w:t>12</w:t>
+      </w:r>
+      <w:r>
+        <w:fldChar w:fldCharType="end"/>
+      </w:r>
+      <w:r>
+        <w:t>: Wordle</w:t>
+      </w:r>
     </w:p>
     <w:p>
       <w:pPr>
@@ -3633,45 +6582,19 @@
     <w:p>
       <w:pPr>
         <w:pStyle w:val="Heading2"/>
-        <w:rPr>
-          <w:lang w:val="fr-FR"/>
-        </w:rPr>
       </w:pPr>
       <w:bookmarkStart w:id="25" w:name="_Toc217572543"/>
       <w:r>
-        <w:rPr>
-          <w:lang w:val="fr-FR"/>
-        </w:rPr>
-        <w:t>Sol</w:t>
-      </w:r>
-      <w:r>
-        <w:rPr>
-          <w:lang w:val="fr-FR"/>
-        </w:rPr>
-        <w:t xml:space="preserve">ution </w:t>
-      </w:r>
-      <w:proofErr w:type="spellStart"/>
-      <w:r>
-        <w:rPr>
-          <w:lang w:val="fr-FR"/>
-        </w:rPr>
-        <w:t>Idea</w:t>
+        <w:t>Solution Idea</w:t>
       </w:r>
       <w:bookmarkEnd w:id="25"/>
-      <w:proofErr w:type="spellEnd"/>
     </w:p>
     <w:p>
       <w:pPr>
         <w:pStyle w:val="Heading2"/>
-        <w:rPr>
-          <w:lang w:val="fr-FR"/>
-        </w:rPr>
       </w:pPr>
       <w:bookmarkStart w:id="26" w:name="_Toc217572544"/>
       <w:r>
-        <w:rPr>
-          <w:lang w:val="fr-FR"/>
-        </w:rPr>
         <w:t>Code</w:t>
       </w:r>
       <w:bookmarkEnd w:id="26"/>
@@ -3694,9 +6617,9 @@
     </w:p>
     <w:p/>
     <w:sectPr>
-      <w:headerReference w:type="default" r:id="rId10"/>
-      <w:footerReference w:type="default" r:id="rId11"/>
-      <w:headerReference w:type="first" r:id="rId12"/>
+      <w:headerReference w:type="default" r:id="rId13"/>
+      <w:footerReference w:type="default" r:id="rId14"/>
+      <w:headerReference w:type="first" r:id="rId15"/>
       <w:pgSz w:w="11906" w:h="16838"/>
       <w:pgMar w:top="1872" w:right="1872" w:bottom="1872" w:left="1872" w:header="706" w:footer="706" w:gutter="0"/>
       <w:pgNumType w:start="0"/>

</xml_diff>